<commit_message>
feat: added class documents
</commit_message>
<xml_diff>
--- a/Class-Documents/497-Documents/VmodelViolets_AdministratorManual.docx
+++ b/Class-Documents/497-Documents/VmodelViolets_AdministratorManual.docx
@@ -50,7 +50,7 @@
       </w:pPr>
       <w:sdt>
         <w:sdtPr>
-          <w:id w:val="-1640455061"/>
+          <w:id w:val="652321343"/>
           <w:tag w:val="goog_rdk_0"/>
         </w:sdtPr>
         <w:sdtContent>
@@ -293,7 +293,7 @@
     <w:sdt>
       <w:sdtPr>
         <w:lock w:val="contentLocked"/>
-        <w:id w:val="-1779049470"/>
+        <w:id w:val="-1312947327"/>
         <w:tag w:val="goog_rdk_1"/>
       </w:sdtPr>
       <w:sdtContent>
@@ -582,7 +582,7 @@
     </w:p>
     <w:sdt>
       <w:sdtPr>
-        <w:id w:val="-845727598"/>
+        <w:id w:val="1630881761"/>
         <w:docPartObj>
           <w:docPartGallery w:val="Table of Contents"/>
           <w:docPartUnique w:val="1"/>
@@ -795,7 +795,7 @@
               </w:rPr>
               <w:t xml:space="preserve">2.  System Overview</w:t>
               <w:tab/>
-              <w:t xml:space="preserve">3</w:t>
+              <w:t xml:space="preserve">4</w:t>
             </w:r>
           </w:hyperlink>
           <w:r>
@@ -953,7 +953,7 @@
               </w:rPr>
               <w:t xml:space="preserve">3.  Administrative Procedures</w:t>
               <w:tab/>
-              <w:t xml:space="preserve">4</w:t>
+              <w:t xml:space="preserve">6</w:t>
             </w:r>
           </w:hyperlink>
           <w:r>
@@ -1006,7 +1006,7 @@
               </w:rPr>
               <w:t xml:space="preserve">3.1 Installation</w:t>
               <w:tab/>
-              <w:t xml:space="preserve">5</w:t>
+              <w:t xml:space="preserve">6</w:t>
             </w:r>
           </w:hyperlink>
           <w:r>
@@ -1059,7 +1059,7 @@
               </w:rPr>
               <w:t xml:space="preserve">3.2 Routine Tasks</w:t>
               <w:tab/>
-              <w:t xml:space="preserve">5</w:t>
+              <w:t xml:space="preserve">6</w:t>
             </w:r>
           </w:hyperlink>
           <w:r>
@@ -1112,7 +1112,7 @@
               </w:rPr>
               <w:t xml:space="preserve">3.3 Periodic Administration</w:t>
               <w:tab/>
-              <w:t xml:space="preserve">5</w:t>
+              <w:t xml:space="preserve">6</w:t>
             </w:r>
           </w:hyperlink>
           <w:r>
@@ -1165,7 +1165,7 @@
               </w:rPr>
               <w:t xml:space="preserve">3.4 User Support</w:t>
               <w:tab/>
-              <w:t xml:space="preserve">5</w:t>
+              <w:t xml:space="preserve">6</w:t>
             </w:r>
           </w:hyperlink>
           <w:r>
@@ -1217,7 +1217,7 @@
               </w:rPr>
               <w:t xml:space="preserve">4.  Troubleshooting</w:t>
               <w:tab/>
-              <w:t xml:space="preserve">6</w:t>
+              <w:t xml:space="preserve">7</w:t>
             </w:r>
           </w:hyperlink>
           <w:r>
@@ -1270,7 +1270,7 @@
               </w:rPr>
               <w:t xml:space="preserve">4.1 Dealing with Error Messages and Failures</w:t>
               <w:tab/>
-              <w:t xml:space="preserve">6</w:t>
+              <w:t xml:space="preserve">7</w:t>
             </w:r>
           </w:hyperlink>
           <w:r>
@@ -1323,7 +1323,7 @@
               </w:rPr>
               <w:t xml:space="preserve">4.2 Known Bugs and Limitations</w:t>
               <w:tab/>
-              <w:t xml:space="preserve">7</w:t>
+              <w:t xml:space="preserve">8</w:t>
             </w:r>
           </w:hyperlink>
           <w:r>
@@ -1340,16 +1340,11 @@
             </w:tabs>
             <w:spacing w:before="60" w:lineRule="auto"/>
             <w:rPr>
-              <w:rFonts w:ascii="Arial" w:cs="Arial" w:eastAsia="Arial" w:hAnsi="Arial"/>
-              <w:b w:val="1"/>
-              <w:bCs w:val="1"/>
               <w:i w:val="0"/>
               <w:iCs w:val="0"/>
               <w:smallCaps w:val="0"/>
               <w:strike w:val="0"/>
               <w:color w:val="000000"/>
-              <w:sz w:val="22"/>
-              <w:szCs w:val="22"/>
               <w:u w:val="none"/>
               <w:shd w:fill="auto" w:val="clear"/>
               <w:vertAlign w:val="baseline"/>
@@ -1358,16 +1353,11 @@
           <w:hyperlink w:anchor="_heading=h.la44mmu0k5a">
             <w:r>
               <w:rPr>
-                <w:rFonts w:ascii="Times New Roman" w:cs="Times New Roman" w:eastAsia="Times New Roman" w:hAnsi="Times New Roman"/>
-                <w:b w:val="0"/>
-                <w:bCs w:val="0"/>
                 <w:i w:val="0"/>
                 <w:iCs w:val="0"/>
                 <w:smallCaps w:val="0"/>
                 <w:strike w:val="0"/>
                 <w:color w:val="000000"/>
-                <w:sz w:val="24"/>
-                <w:szCs w:val="24"/>
                 <w:u w:val="none"/>
                 <w:shd w:fill="auto" w:val="clear"/>
                 <w:vertAlign w:val="baseline"/>
@@ -1375,7 +1365,7 @@
               </w:rPr>
               <w:t xml:space="preserve">Appendix A – Team Review Sign-off</w:t>
               <w:tab/>
-              <w:t xml:space="preserve">9</w:t>
+              <w:t xml:space="preserve">10</w:t>
             </w:r>
           </w:hyperlink>
           <w:r>
@@ -1392,16 +1382,53 @@
             </w:tabs>
             <w:spacing w:before="60" w:lineRule="auto"/>
             <w:rPr>
-              <w:rFonts w:ascii="Arial" w:cs="Arial" w:eastAsia="Arial" w:hAnsi="Arial"/>
-              <w:b w:val="1"/>
-              <w:bCs w:val="1"/>
               <w:i w:val="0"/>
               <w:iCs w:val="0"/>
               <w:smallCaps w:val="0"/>
               <w:strike w:val="0"/>
               <w:color w:val="000000"/>
-              <w:sz w:val="22"/>
-              <w:szCs w:val="22"/>
+              <w:u w:val="none"/>
+              <w:shd w:fill="auto" w:val="clear"/>
+              <w:vertAlign w:val="baseline"/>
+            </w:rPr>
+          </w:pPr>
+          <w:hyperlink w:anchor="_heading=h.eltaa81deuo2">
+            <w:r>
+              <w:rPr>
+                <w:i w:val="0"/>
+                <w:iCs w:val="0"/>
+                <w:smallCaps w:val="0"/>
+                <w:strike w:val="0"/>
+                <w:color w:val="000000"/>
+                <w:u w:val="none"/>
+                <w:shd w:fill="auto" w:val="clear"/>
+                <w:vertAlign w:val="baseline"/>
+                <w:rtl w:val="0"/>
+              </w:rPr>
+              <w:t xml:space="preserve">Appendix B – Client Review Sign-off</w:t>
+              <w:tab/>
+              <w:t xml:space="preserve">11</w:t>
+            </w:r>
+          </w:hyperlink>
+          <w:r>
+            <w:rPr>
+              <w:rtl w:val="0"/>
+            </w:rPr>
+          </w:r>
+        </w:p>
+        <w:p>
+          <w:pPr>
+            <w:widowControl w:val="0"/>
+            <w:tabs>
+              <w:tab w:val="right" w:leader="dot" w:pos="12000"/>
+            </w:tabs>
+            <w:spacing w:before="60" w:lineRule="auto"/>
+            <w:rPr>
+              <w:i w:val="0"/>
+              <w:iCs w:val="0"/>
+              <w:smallCaps w:val="0"/>
+              <w:strike w:val="0"/>
+              <w:color w:val="000000"/>
               <w:u w:val="none"/>
               <w:shd w:fill="auto" w:val="clear"/>
               <w:vertAlign w:val="baseline"/>
@@ -1410,24 +1437,19 @@
           <w:hyperlink w:anchor="_heading=h.20v7p51yjpsw">
             <w:r>
               <w:rPr>
-                <w:rFonts w:ascii="Times New Roman" w:cs="Times New Roman" w:eastAsia="Times New Roman" w:hAnsi="Times New Roman"/>
-                <w:b w:val="0"/>
-                <w:bCs w:val="0"/>
                 <w:i w:val="0"/>
                 <w:iCs w:val="0"/>
                 <w:smallCaps w:val="0"/>
                 <w:strike w:val="0"/>
                 <w:color w:val="000000"/>
-                <w:sz w:val="24"/>
-                <w:szCs w:val="24"/>
                 <w:u w:val="none"/>
                 <w:shd w:fill="auto" w:val="clear"/>
                 <w:vertAlign w:val="baseline"/>
                 <w:rtl w:val="0"/>
               </w:rPr>
-              <w:t xml:space="preserve">Appendix B – Document Contributions</w:t>
+              <w:t xml:space="preserve">Appendix C – Document Contributions</w:t>
               <w:tab/>
-              <w:t xml:space="preserve">10</w:t>
+              <w:t xml:space="preserve">12</w:t>
             </w:r>
           </w:hyperlink>
           <w:r>
@@ -1463,15 +1485,6 @@
       </w:pPr>
       <w:bookmarkStart w:colFirst="0" w:colLast="0" w:name="_heading=h.pqjginmc2dke" w:id="0"/>
       <w:bookmarkEnd w:id="0"/>
-      <w:sdt>
-        <w:sdtPr>
-          <w:id w:val="1681647496"/>
-          <w:tag w:val="goog_rdk_2"/>
-        </w:sdtPr>
-        <w:sdtContent>
-          <w:commentRangeStart w:id="1"/>
-        </w:sdtContent>
-      </w:sdt>
       <w:r>
         <w:rPr>
           <w:rFonts w:ascii="Times New Roman" w:cs="Times New Roman" w:eastAsia="Times New Roman" w:hAnsi="Times New Roman"/>
@@ -1479,9 +1492,32 @@
         </w:rPr>
         <w:t xml:space="preserve">1.  Introduction</w:t>
       </w:r>
-      <w:commentRangeEnd w:id="1"/>
-      <w:r>
-        <w:commentReference w:id="1"/>
+      <w:r>
+        <w:rPr>
+          <w:rtl w:val="0"/>
+        </w:rPr>
+      </w:r>
+    </w:p>
+    <w:p>
+      <w:pPr>
+        <w:rPr/>
+      </w:pPr>
+      <w:r>
+        <w:rPr>
+          <w:rtl w:val="0"/>
+        </w:rPr>
+      </w:r>
+    </w:p>
+    <w:p>
+      <w:pPr>
+        <w:ind w:left="0" w:firstLine="0"/>
+        <w:rPr/>
+      </w:pPr>
+      <w:r>
+        <w:rPr>
+          <w:rtl w:val="0"/>
+        </w:rPr>
+        <w:t xml:space="preserve">This project, titled ClimateReanalyzer and OpenSpace Interface, is a comprehensive capstone project for University of Maine Computer Science students on V-Model Violets (formerly known as Team Violet). This project will be developed in collaboration with Dr. Sean Birkel, a Research Assistant Professor at the Climate Change Institute, and Sean Laatsch, the Director of the Versant Planetarium at the University of Maine. This project will also be collaborating with Dr. Carter Emmart and Micah Acinapura from the OpenSpace team. The goal of this project is to create an image map server that utilizes data from the Climate Reanalyzer, enabling its use by OpenSpace and in planetariums or other research settings.</w:t>
       </w:r>
       <w:r>
         <w:rPr>
@@ -1512,53 +1548,6 @@
         </w:rPr>
         <w:t xml:space="preserve">1.1  Purpose of This Document</w:t>
       </w:r>
-    </w:p>
-    <w:p>
-      <w:pPr>
-        <w:rPr/>
-      </w:pPr>
-      <w:r>
-        <w:rPr>
-          <w:rtl w:val="0"/>
-        </w:rPr>
-      </w:r>
-    </w:p>
-    <w:p>
-      <w:pPr>
-        <w:rPr/>
-      </w:pPr>
-      <w:sdt>
-        <w:sdtPr>
-          <w:id w:val="-43858952"/>
-          <w:tag w:val="goog_rdk_3"/>
-        </w:sdtPr>
-        <w:sdtContent>
-          <w:commentRangeStart w:id="2"/>
-        </w:sdtContent>
-      </w:sdt>
-      <w:r>
-        <w:rPr>
-          <w:rtl w:val="0"/>
-        </w:rPr>
-        <w:t xml:space="preserve">State the purpose of the document and </w:t>
-      </w:r>
-      <w:r>
-        <w:rPr>
-          <w:u w:val="single"/>
-          <w:rtl w:val="0"/>
-        </w:rPr>
-        <w:t xml:space="preserve">indicate the intended readership</w:t>
-      </w:r>
-      <w:r>
-        <w:rPr>
-          <w:rtl w:val="0"/>
-        </w:rPr>
-        <w:t xml:space="preserve">. Briefly summarize the content. [One substantial paragraph]</w:t>
-      </w:r>
-      <w:commentRangeEnd w:id="2"/>
-      <w:r>
-        <w:commentReference w:id="2"/>
-      </w:r>
       <w:r>
         <w:rPr>
           <w:rtl w:val="0"/>
@@ -1585,24 +1574,11 @@
         </w:rPr>
         <w:t xml:space="preserve">This document is intended for the System Administrator for the </w:t>
       </w:r>
-      <w:sdt>
-        <w:sdtPr>
-          <w:id w:val="-1410304928"/>
-          <w:tag w:val="goog_rdk_4"/>
-        </w:sdtPr>
-        <w:sdtContent>
-          <w:commentRangeStart w:id="3"/>
-        </w:sdtContent>
-      </w:sdt>
-      <w:r>
-        <w:rPr>
-          <w:rtl w:val="0"/>
-        </w:rPr>
-        <w:t xml:space="preserve">ClimateReanalyzer X Openspace</w:t>
-      </w:r>
-      <w:commentRangeEnd w:id="3"/>
-      <w:r>
-        <w:commentReference w:id="3"/>
+      <w:r>
+        <w:rPr>
+          <w:rtl w:val="0"/>
+        </w:rPr>
+        <w:t xml:space="preserve">ClimateReanalyzer and OpenSpace</w:t>
       </w:r>
       <w:r>
         <w:rPr>
@@ -1690,24 +1666,11 @@
         <w:jc w:val="left"/>
         <w:rPr/>
       </w:pPr>
-      <w:sdt>
-        <w:sdtPr>
-          <w:id w:val="-878089333"/>
-          <w:tag w:val="goog_rdk_5"/>
-        </w:sdtPr>
-        <w:sdtContent>
-          <w:commentRangeStart w:id="4"/>
-        </w:sdtContent>
-      </w:sdt>
       <w:r>
         <w:rPr>
           <w:rtl w:val="0"/>
         </w:rPr>
         <w:t xml:space="preserve">B</w:t>
-      </w:r>
-      <w:commentRangeEnd w:id="4"/>
-      <w:r>
-        <w:commentReference w:id="4"/>
       </w:r>
       <w:r>
         <w:rPr>
@@ -2046,26 +2009,6 @@
     </w:p>
     <w:p>
       <w:pPr>
-        <w:rPr/>
-      </w:pPr>
-      <w:r>
-        <w:rPr>
-          <w:rtl w:val="0"/>
-        </w:rPr>
-      </w:r>
-    </w:p>
-    <w:p>
-      <w:pPr>
-        <w:rPr/>
-      </w:pPr>
-      <w:r>
-        <w:rPr>
-          <w:rtl w:val="0"/>
-        </w:rPr>
-      </w:r>
-    </w:p>
-    <w:p>
-      <w:pPr>
         <w:pStyle w:val="Heading1"/>
         <w:rPr>
           <w:rFonts w:ascii="Times New Roman" w:cs="Times New Roman" w:eastAsia="Times New Roman" w:hAnsi="Times New Roman"/>
@@ -2073,24 +2016,6 @@
       </w:pPr>
       <w:bookmarkStart w:colFirst="0" w:colLast="0" w:name="_heading=h.dd27aix7x5ti" w:id="3"/>
       <w:bookmarkEnd w:id="3"/>
-      <w:sdt>
-        <w:sdtPr>
-          <w:id w:val="480688318"/>
-          <w:tag w:val="goog_rdk_6"/>
-        </w:sdtPr>
-        <w:sdtContent>
-          <w:commentRangeStart w:id="5"/>
-        </w:sdtContent>
-      </w:sdt>
-      <w:sdt>
-        <w:sdtPr>
-          <w:id w:val="199658744"/>
-          <w:tag w:val="goog_rdk_7"/>
-        </w:sdtPr>
-        <w:sdtContent>
-          <w:commentRangeStart w:id="6"/>
-        </w:sdtContent>
-      </w:sdt>
       <w:r>
         <w:rPr>
           <w:rFonts w:ascii="Times New Roman" w:cs="Times New Roman" w:eastAsia="Times New Roman" w:hAnsi="Times New Roman"/>
@@ -2098,13 +2023,32 @@
         </w:rPr>
         <w:t xml:space="preserve">2.  System Overview</w:t>
       </w:r>
-      <w:commentRangeEnd w:id="5"/>
-      <w:r>
-        <w:commentReference w:id="5"/>
-      </w:r>
-      <w:commentRangeEnd w:id="6"/>
-      <w:r>
-        <w:commentReference w:id="6"/>
+      <w:r>
+        <w:rPr>
+          <w:rtl w:val="0"/>
+        </w:rPr>
+      </w:r>
+    </w:p>
+    <w:p>
+      <w:pPr>
+        <w:rPr/>
+      </w:pPr>
+      <w:r>
+        <w:rPr>
+          <w:rtl w:val="0"/>
+        </w:rPr>
+      </w:r>
+    </w:p>
+    <w:p>
+      <w:pPr>
+        <w:rPr/>
+      </w:pPr>
+      <w:r>
+        <w:rPr>
+          <w:rtl w:val="0"/>
+        </w:rPr>
+        <w:tab/>
+        <w:t xml:space="preserve">This section provides an overview of the OpenSpace Climate Reanalyzer Interface, including its purpose, structure, and key components. It explains how the system operates, the technologies it relies on, and the requirements needed to run and maintain it. The system uses Geospatial Data Abstraction Library (GDAL) to process large climate datasets into smaller tiles that can be efficiently stored and delivered. This section is for administrators to give a clear understanding of how the system functions before detailed procedures. </w:t>
       </w:r>
       <w:r>
         <w:rPr>
@@ -2181,24 +2125,11 @@
         </w:rPr>
         <w:t xml:space="preserve">The system works by taking large climate images and converting them into smaller tiles using </w:t>
       </w:r>
-      <w:sdt>
-        <w:sdtPr>
-          <w:id w:val="2098726880"/>
-          <w:tag w:val="goog_rdk_8"/>
-        </w:sdtPr>
-        <w:sdtContent>
-          <w:commentRangeStart w:id="7"/>
-        </w:sdtContent>
-      </w:sdt>
       <w:r>
         <w:rPr>
           <w:rtl w:val="0"/>
         </w:rPr>
         <w:t xml:space="preserve">GDAL </w:t>
-      </w:r>
-      <w:commentRangeEnd w:id="7"/>
-      <w:r>
-        <w:commentReference w:id="7"/>
       </w:r>
       <w:r>
         <w:rPr>
@@ -2514,53 +2445,58 @@
           <w:rFonts w:ascii="Times New Roman" w:cs="Times New Roman" w:eastAsia="Times New Roman" w:hAnsi="Times New Roman"/>
         </w:rPr>
       </w:pPr>
-      <w:bookmarkStart w:colFirst="0" w:colLast="0" w:name="_heading=h.9lx5xu5cj7ld" w:id="6"/>
+      <w:bookmarkStart w:colFirst="0" w:colLast="0" w:name="_heading=h.yzisehmzehzz" w:id="6"/>
       <w:bookmarkEnd w:id="6"/>
-      <w:sdt>
-        <w:sdtPr>
-          <w:id w:val="1699656137"/>
-          <w:tag w:val="goog_rdk_9"/>
-        </w:sdtPr>
-        <w:sdtContent>
-          <w:commentRangeStart w:id="8"/>
-        </w:sdtContent>
-      </w:sdt>
-      <w:r>
+      <w:r>
+        <w:br w:type="page"/>
+      </w:r>
+      <w:r>
+        <w:rPr>
+          <w:rtl w:val="0"/>
+        </w:rPr>
+      </w:r>
+    </w:p>
+    <w:p>
+      <w:pPr>
+        <w:pStyle w:val="Heading1"/>
         <w:rPr>
           <w:rFonts w:ascii="Times New Roman" w:cs="Times New Roman" w:eastAsia="Times New Roman" w:hAnsi="Times New Roman"/>
+        </w:rPr>
+      </w:pPr>
+      <w:bookmarkStart w:colFirst="0" w:colLast="0" w:name="_heading=h.9lx5xu5cj7ld" w:id="7"/>
+      <w:bookmarkEnd w:id="7"/>
+      <w:r>
+        <w:rPr>
+          <w:rFonts w:ascii="Times New Roman" w:cs="Times New Roman" w:eastAsia="Times New Roman" w:hAnsi="Times New Roman"/>
           <w:rtl w:val="0"/>
         </w:rPr>
         <w:t xml:space="preserve">3.  Administrative Procedures</w:t>
       </w:r>
-      <w:commentRangeEnd w:id="8"/>
-      <w:r>
-        <w:commentReference w:id="8"/>
-      </w:r>
-      <w:r>
-        <w:rPr>
-          <w:rtl w:val="0"/>
-        </w:rPr>
-      </w:r>
-    </w:p>
-    <w:p>
-      <w:pPr>
-        <w:rPr/>
-      </w:pPr>
-      <w:r>
-        <w:rPr>
-          <w:rtl w:val="0"/>
-        </w:rPr>
-      </w:r>
-    </w:p>
-    <w:p>
-      <w:pPr>
-        <w:rPr/>
-      </w:pPr>
-      <w:r>
-        <w:rPr>
-          <w:rtl w:val="0"/>
-        </w:rPr>
-        <w:t xml:space="preserve">This section serves as important information for the program admin to have. It outlines information such as the installation process, routine and period tasks the administrator must perform, as well as the ways in which users are able to get support. </w:t>
+      <w:r>
+        <w:rPr>
+          <w:rtl w:val="0"/>
+        </w:rPr>
+      </w:r>
+    </w:p>
+    <w:p>
+      <w:pPr>
+        <w:rPr/>
+      </w:pPr>
+      <w:r>
+        <w:rPr>
+          <w:rtl w:val="0"/>
+        </w:rPr>
+      </w:r>
+    </w:p>
+    <w:p>
+      <w:pPr>
+        <w:rPr/>
+      </w:pPr>
+      <w:r>
+        <w:rPr>
+          <w:rtl w:val="0"/>
+        </w:rPr>
+        <w:t xml:space="preserve">This section serves as important information for the program admin to have. It outlines information such as the installation process, routine and periodic tasks the administrator must perform, as well as the ways in which users are able to get support. </w:t>
       </w:r>
     </w:p>
     <w:p>
@@ -2579,8 +2515,8 @@
         <w:pStyle w:val="Heading2"/>
         <w:rPr/>
       </w:pPr>
-      <w:bookmarkStart w:colFirst="0" w:colLast="0" w:name="_heading=h.hu0j1taw2j8d" w:id="7"/>
-      <w:bookmarkEnd w:id="7"/>
+      <w:bookmarkStart w:colFirst="0" w:colLast="0" w:name="_heading=h.hu0j1taw2j8d" w:id="8"/>
+      <w:bookmarkEnd w:id="8"/>
       <w:r>
         <w:rPr>
           <w:rtl w:val="0"/>
@@ -2689,8 +2625,8 @@
         <w:pStyle w:val="Heading2"/>
         <w:rPr/>
       </w:pPr>
-      <w:bookmarkStart w:colFirst="0" w:colLast="0" w:name="_heading=h.j15nsh3k7js" w:id="8"/>
-      <w:bookmarkEnd w:id="8"/>
+      <w:bookmarkStart w:colFirst="0" w:colLast="0" w:name="_heading=h.j15nsh3k7js" w:id="9"/>
+      <w:bookmarkEnd w:id="9"/>
       <w:r>
         <w:rPr>
           <w:rtl w:val="0"/>
@@ -2736,8 +2672,8 @@
         <w:pStyle w:val="Heading2"/>
         <w:rPr/>
       </w:pPr>
-      <w:bookmarkStart w:colFirst="0" w:colLast="0" w:name="_heading=h.8mre6xsv8gku" w:id="9"/>
-      <w:bookmarkEnd w:id="9"/>
+      <w:bookmarkStart w:colFirst="0" w:colLast="0" w:name="_heading=h.8mre6xsv8gku" w:id="10"/>
+      <w:bookmarkEnd w:id="10"/>
       <w:r>
         <w:rPr>
           <w:rtl w:val="0"/>
@@ -2764,32 +2700,29 @@
         <w:rPr>
           <w:rtl w:val="0"/>
         </w:rPr>
-        <w:t xml:space="preserve">The only periodic task to be performed will be the periodic running of an sh script in the terminal of the virtual machine environment. </w:t>
-      </w:r>
-      <w:sdt>
-        <w:sdtPr>
-          <w:id w:val="-344532841"/>
-          <w:tag w:val="goog_rdk_10"/>
-        </w:sdtPr>
-        <w:sdtContent>
-          <w:commentRangeStart w:id="9"/>
-        </w:sdtContent>
-      </w:sdt>
-      <w:r>
-        <w:rPr>
-          <w:rtl w:val="0"/>
-        </w:rPr>
-        <w:t xml:space="preserve">This will be performed by Dr. Sean Birkel when he adds new data to the server</w:t>
-      </w:r>
-      <w:commentRangeEnd w:id="9"/>
-      <w:r>
-        <w:commentReference w:id="9"/>
-      </w:r>
-      <w:r>
-        <w:rPr>
-          <w:rtl w:val="0"/>
-        </w:rPr>
-        <w:t xml:space="preserve">. </w:t>
+        <w:t xml:space="preserve">The only periodic task to be performed will be the periodic running of a shell script in the terminal of the virtual machine environment. This will be performed by Dr. Sean Birkel when new data is added to the server. </w:t>
+      </w:r>
+    </w:p>
+    <w:p>
+      <w:pPr>
+        <w:rPr/>
+      </w:pPr>
+      <w:r>
+        <w:rPr>
+          <w:rtl w:val="0"/>
+        </w:rPr>
+        <w:tab/>
+        <w:t xml:space="preserve">To run the sh script: sh script-name-here.sh</w:t>
+      </w:r>
+    </w:p>
+    <w:p>
+      <w:pPr>
+        <w:rPr/>
+      </w:pPr>
+      <w:r>
+        <w:rPr>
+          <w:rtl w:val="0"/>
+        </w:rPr>
       </w:r>
     </w:p>
     <w:p>
@@ -2808,8 +2741,8 @@
         <w:pStyle w:val="Heading2"/>
         <w:rPr/>
       </w:pPr>
-      <w:bookmarkStart w:colFirst="0" w:colLast="0" w:name="_heading=h.8ei7a1brv13l" w:id="10"/>
-      <w:bookmarkEnd w:id="10"/>
+      <w:bookmarkStart w:colFirst="0" w:colLast="0" w:name="_heading=h.8ei7a1brv13l" w:id="11"/>
+      <w:bookmarkEnd w:id="11"/>
       <w:r>
         <w:rPr>
           <w:rtl w:val="0"/>
@@ -2836,7 +2769,7 @@
         <w:rPr>
           <w:rtl w:val="0"/>
         </w:rPr>
-        <w:t xml:space="preserve">Should the user require or desire support, there are various avenues they may use to get the specific support they desire. OpenSpace and the Climate Reanalyzer and OpenSpace Interface are all open source, so they are accessible and maintained by members of the general public. The Climate Reanalyzer itself is run by Dr. Sean Birkel at the University of Maine. Users may reach out to any of the below areas, but responses will be most likely and prompted from OpenSpace.</w:t>
+        <w:t xml:space="preserve">Should the user require or desire support, there are various avenues they may use to get the specific support they desire. OpenSpace and the Climate Reanalyzer and OpenSpace Interface are all open source, so they are accessible and maintained by members of the general public. The Climate Reanalyzer itself is run by Dr. Sean Birkel at the University of Maine. Users may reach out to any of the below areas, but responses will most likely be prompted from OpenSpace.</w:t>
       </w:r>
     </w:p>
     <w:p>
@@ -3107,77 +3040,279 @@
           <w:rFonts w:ascii="Times New Roman" w:cs="Times New Roman" w:eastAsia="Times New Roman" w:hAnsi="Times New Roman"/>
         </w:rPr>
       </w:pPr>
-      <w:bookmarkStart w:colFirst="0" w:colLast="0" w:name="_heading=h.ssqtiu3g1ald" w:id="11"/>
-      <w:bookmarkEnd w:id="11"/>
+      <w:bookmarkStart w:colFirst="0" w:colLast="0" w:name="_heading=h.ssqtiu3g1ald" w:id="12"/>
+      <w:bookmarkEnd w:id="12"/>
+      <w:r>
+        <w:rPr>
+          <w:rFonts w:ascii="Times New Roman" w:cs="Times New Roman" w:eastAsia="Times New Roman" w:hAnsi="Times New Roman"/>
+          <w:rtl w:val="0"/>
+        </w:rPr>
+        <w:t xml:space="preserve">4.  Troubleshooting</w:t>
+      </w:r>
+      <w:r>
+        <w:rPr>
+          <w:rtl w:val="0"/>
+        </w:rPr>
+      </w:r>
+    </w:p>
+    <w:p>
+      <w:pPr>
+        <w:rPr/>
+      </w:pPr>
+      <w:r>
+        <w:rPr>
+          <w:rtl w:val="0"/>
+        </w:rPr>
+      </w:r>
+    </w:p>
+    <w:p>
+      <w:pPr>
+        <w:rPr/>
+      </w:pPr>
+      <w:r>
+        <w:rPr>
+          <w:rtl w:val="0"/>
+        </w:rPr>
+        <w:t xml:space="preserve">This section guides the identification and resolution of common issues encountered while using the system. It outlines typical error scenarios, their causes, and recommended troubleshooting steps, along with known limitations that may impact functionality. This information helps users and administrators diagnose problems and understand current system constraints.</w:t>
+      </w:r>
+      <w:r>
+        <w:rPr>
+          <w:rtl w:val="0"/>
+        </w:rPr>
+      </w:r>
+    </w:p>
+    <w:p>
+      <w:pPr>
+        <w:rPr/>
+      </w:pPr>
+      <w:r>
+        <w:rPr>
+          <w:rtl w:val="0"/>
+        </w:rPr>
+      </w:r>
+    </w:p>
+    <w:p>
+      <w:pPr>
+        <w:pStyle w:val="Heading2"/>
+        <w:rPr/>
+      </w:pPr>
+      <w:bookmarkStart w:colFirst="0" w:colLast="0" w:name="_heading=h.hgp63pl32j5d" w:id="13"/>
+      <w:bookmarkEnd w:id="13"/>
+      <w:r>
+        <w:rPr>
+          <w:rtl w:val="0"/>
+        </w:rPr>
+        <w:t xml:space="preserve">4.1 Dealing with Error Messages and Failures</w:t>
+      </w:r>
+    </w:p>
+    <w:p>
+      <w:pPr>
+        <w:rPr/>
+      </w:pPr>
+      <w:r>
+        <w:rPr>
+          <w:rtl w:val="0"/>
+        </w:rPr>
+      </w:r>
+    </w:p>
+    <w:p>
+      <w:pPr>
+        <w:rPr/>
+      </w:pPr>
+      <w:r>
+        <w:rPr>
+          <w:rtl w:val="0"/>
+        </w:rPr>
+        <w:t xml:space="preserve">When using the system, most errors fall into three categories: connection issues, data input issues, and rendering issues.</w:t>
+      </w:r>
+    </w:p>
+    <w:p>
+      <w:pPr>
+        <w:rPr/>
+      </w:pPr>
+      <w:r>
+        <w:rPr>
+          <w:rtl w:val="0"/>
+        </w:rPr>
+      </w:r>
+    </w:p>
+    <w:p>
+      <w:pPr>
+        <w:numPr>
+          <w:ilvl w:val="0"/>
+          <w:numId w:val="7"/>
+        </w:numPr>
+        <w:ind w:left="720" w:hanging="360"/>
+        <w:rPr/>
+      </w:pPr>
+      <w:r>
+        <w:rPr>
+          <w:rtl w:val="0"/>
+        </w:rPr>
+        <w:t xml:space="preserve">OpenSpace Connection Failures</w:t>
+      </w:r>
+    </w:p>
+    <w:p>
+      <w:pPr>
+        <w:numPr>
+          <w:ilvl w:val="1"/>
+          <w:numId w:val="7"/>
+        </w:numPr>
+        <w:ind w:left="1440" w:hanging="360"/>
+        <w:rPr/>
+      </w:pPr>
+      <w:r>
+        <w:rPr>
+          <w:rtl w:val="0"/>
+        </w:rPr>
+        <w:t xml:space="preserve">If the frontend portion of the project is unable to connect to OpenSpace, the UI will display an error such as “OpenSpace API not available” or “Disconnected from OpenSpace.”</w:t>
+      </w:r>
+    </w:p>
+    <w:p>
+      <w:pPr>
+        <w:numPr>
+          <w:ilvl w:val="1"/>
+          <w:numId w:val="7"/>
+        </w:numPr>
+        <w:ind w:left="1440" w:hanging="360"/>
+        <w:rPr/>
+      </w:pPr>
+      <w:r>
+        <w:rPr>
+          <w:rtl w:val="0"/>
+        </w:rPr>
+        <w:t xml:space="preserve">Common causes:</w:t>
+      </w:r>
+    </w:p>
+    <w:p>
+      <w:pPr>
+        <w:numPr>
+          <w:ilvl w:val="2"/>
+          <w:numId w:val="7"/>
+        </w:numPr>
+        <w:ind w:left="2160" w:hanging="360"/>
+        <w:rPr/>
+      </w:pPr>
+      <w:r>
+        <w:rPr>
+          <w:rtl w:val="0"/>
+        </w:rPr>
+        <w:t xml:space="preserve">OpenSpace is not running</w:t>
+      </w:r>
+    </w:p>
+    <w:p>
+      <w:pPr>
+        <w:numPr>
+          <w:ilvl w:val="2"/>
+          <w:numId w:val="7"/>
+        </w:numPr>
+        <w:ind w:left="2160" w:hanging="360"/>
+        <w:rPr/>
+      </w:pPr>
+      <w:r>
+        <w:rPr>
+          <w:rtl w:val="0"/>
+        </w:rPr>
+        <w:t xml:space="preserve">Incorrect IP address or port</w:t>
+      </w:r>
+    </w:p>
+    <w:p>
+      <w:pPr>
+        <w:numPr>
+          <w:ilvl w:val="2"/>
+          <w:numId w:val="7"/>
+        </w:numPr>
+        <w:ind w:left="2160" w:hanging="360"/>
+        <w:rPr/>
+      </w:pPr>
+      <w:r>
+        <w:rPr>
+          <w:rtl w:val="0"/>
+        </w:rPr>
+        <w:t xml:space="preserve">WebSocket connection blocked</w:t>
+      </w:r>
+    </w:p>
+    <w:p>
+      <w:pPr>
+        <w:numPr>
+          <w:ilvl w:val="1"/>
+          <w:numId w:val="7"/>
+        </w:numPr>
+        <w:ind w:left="1440" w:hanging="360"/>
+        <w:rPr/>
+      </w:pPr>
       <w:sdt>
         <w:sdtPr>
-          <w:id w:val="2057244097"/>
-          <w:tag w:val="goog_rdk_11"/>
+          <w:id w:val="-319282469"/>
+          <w:tag w:val="goog_rdk_2"/>
         </w:sdtPr>
         <w:sdtContent>
-          <w:commentRangeStart w:id="10"/>
+          <w:commentRangeStart w:id="1"/>
         </w:sdtContent>
       </w:sdt>
       <w:r>
         <w:rPr>
-          <w:rFonts w:ascii="Times New Roman" w:cs="Times New Roman" w:eastAsia="Times New Roman" w:hAnsi="Times New Roman"/>
-          <w:rtl w:val="0"/>
-        </w:rPr>
-        <w:t xml:space="preserve">4.  Troubleshooting</w:t>
-      </w:r>
-      <w:commentRangeEnd w:id="10"/>
-      <w:r>
-        <w:commentReference w:id="10"/>
-      </w:r>
-      <w:r>
-        <w:rPr>
-          <w:rtl w:val="0"/>
-        </w:rPr>
-      </w:r>
-    </w:p>
-    <w:p>
-      <w:pPr>
-        <w:pStyle w:val="Heading2"/>
-        <w:rPr/>
-      </w:pPr>
-      <w:bookmarkStart w:colFirst="0" w:colLast="0" w:name="_heading=h.hgp63pl32j5d" w:id="12"/>
-      <w:bookmarkEnd w:id="12"/>
-      <w:r>
-        <w:rPr>
-          <w:rtl w:val="0"/>
-        </w:rPr>
-        <w:t xml:space="preserve">4.1 Dealing with Error Messages and Failures</w:t>
-      </w:r>
-    </w:p>
-    <w:p>
-      <w:pPr>
-        <w:rPr/>
-      </w:pPr>
-      <w:r>
-        <w:rPr>
-          <w:rtl w:val="0"/>
-        </w:rPr>
-      </w:r>
-    </w:p>
-    <w:p>
-      <w:pPr>
-        <w:rPr/>
-      </w:pPr>
-      <w:r>
-        <w:rPr>
-          <w:rtl w:val="0"/>
-        </w:rPr>
-        <w:t xml:space="preserve">When using the system, most errors fall into three categories: connection issues, data input issues, and rendering issues.</w:t>
-      </w:r>
-    </w:p>
-    <w:p>
-      <w:pPr>
-        <w:rPr/>
-      </w:pPr>
-      <w:r>
-        <w:rPr>
-          <w:rtl w:val="0"/>
-        </w:rPr>
+          <w:rtl w:val="0"/>
+        </w:rPr>
+        <w:t xml:space="preserve">Troubleshooting Tips</w:t>
+      </w:r>
+      <w:commentRangeEnd w:id="1"/>
+      <w:r>
+        <w:commentReference w:id="1"/>
+      </w:r>
+      <w:r>
+        <w:rPr>
+          <w:rtl w:val="0"/>
+        </w:rPr>
+        <w:t xml:space="preserve">:</w:t>
+      </w:r>
+    </w:p>
+    <w:p>
+      <w:pPr>
+        <w:numPr>
+          <w:ilvl w:val="2"/>
+          <w:numId w:val="7"/>
+        </w:numPr>
+        <w:ind w:left="2160" w:hanging="360"/>
+        <w:rPr/>
+      </w:pPr>
+      <w:r>
+        <w:rPr>
+          <w:rtl w:val="0"/>
+        </w:rPr>
+        <w:t xml:space="preserve">Ensure OpenSpace is running</w:t>
+      </w:r>
+    </w:p>
+    <w:p>
+      <w:pPr>
+        <w:numPr>
+          <w:ilvl w:val="2"/>
+          <w:numId w:val="7"/>
+        </w:numPr>
+        <w:ind w:left="2160" w:hanging="360"/>
+        <w:rPr/>
+      </w:pPr>
+      <w:r>
+        <w:rPr>
+          <w:rtl w:val="0"/>
+        </w:rPr>
+        <w:t xml:space="preserve">Verify the IP address in the input field</w:t>
+      </w:r>
+    </w:p>
+    <w:p>
+      <w:pPr>
+        <w:numPr>
+          <w:ilvl w:val="2"/>
+          <w:numId w:val="7"/>
+        </w:numPr>
+        <w:ind w:left="2160" w:hanging="360"/>
+        <w:rPr/>
+      </w:pPr>
+      <w:r>
+        <w:rPr>
+          <w:rtl w:val="0"/>
+        </w:rPr>
+        <w:t xml:space="preserve">Refresh the page and reconnect using the “Connect” button</w:t>
       </w:r>
     </w:p>
     <w:p>
@@ -3193,7 +3328,7 @@
         <w:rPr>
           <w:rtl w:val="0"/>
         </w:rPr>
-        <w:t xml:space="preserve">OpenSpace Connection Failures</w:t>
+        <w:t xml:space="preserve">Tile Server Errors</w:t>
       </w:r>
     </w:p>
     <w:p>
@@ -3209,7 +3344,7 @@
         <w:rPr>
           <w:rtl w:val="0"/>
         </w:rPr>
-        <w:t xml:space="preserve">If the frontend portion of the project is unable to connect to OpenSpace, the UI will display an error such as “OpenSpace API not available” or “Disconnected from OpenSpace.”</w:t>
+        <w:t xml:space="preserve">If tiles fail to load (blank image icon), the issue is usually with the Apache tile server.</w:t>
       </w:r>
     </w:p>
     <w:p>
@@ -3241,7 +3376,7 @@
         <w:rPr>
           <w:rtl w:val="0"/>
         </w:rPr>
-        <w:t xml:space="preserve">OpenSpace is not running</w:t>
+        <w:t xml:space="preserve">Tile Server is down</w:t>
       </w:r>
     </w:p>
     <w:p>
@@ -3257,7 +3392,23 @@
         <w:rPr>
           <w:rtl w:val="0"/>
         </w:rPr>
-        <w:t xml:space="preserve">Incorrect IP address or port</w:t>
+        <w:t xml:space="preserve">Software Bug</w:t>
+      </w:r>
+    </w:p>
+    <w:p>
+      <w:pPr>
+        <w:numPr>
+          <w:ilvl w:val="1"/>
+          <w:numId w:val="7"/>
+        </w:numPr>
+        <w:ind w:left="1440" w:hanging="360"/>
+        <w:rPr/>
+      </w:pPr>
+      <w:r>
+        <w:rPr>
+          <w:rtl w:val="0"/>
+        </w:rPr>
+        <w:t xml:space="preserve">Troubleshooting Tips:</w:t>
       </w:r>
     </w:p>
     <w:p>
@@ -3267,13 +3418,47 @@
           <w:numId w:val="7"/>
         </w:numPr>
         <w:ind w:left="2160" w:hanging="360"/>
-        <w:rPr/>
-      </w:pPr>
-      <w:r>
-        <w:rPr>
-          <w:rtl w:val="0"/>
-        </w:rPr>
-        <w:t xml:space="preserve">WebSocket connection blocked</w:t>
+        <w:rPr>
+          <w:u w:val="none"/>
+        </w:rPr>
+      </w:pPr>
+      <w:r>
+        <w:rPr>
+          <w:rtl w:val="0"/>
+        </w:rPr>
+        <w:t xml:space="preserve">Reach out to Sean Birkel for Umaine VM status (reanalyzer@gmail.com)</w:t>
+      </w:r>
+    </w:p>
+    <w:p>
+      <w:pPr>
+        <w:numPr>
+          <w:ilvl w:val="2"/>
+          <w:numId w:val="7"/>
+        </w:numPr>
+        <w:ind w:left="2160" w:hanging="360"/>
+        <w:rPr/>
+      </w:pPr>
+      <w:r>
+        <w:rPr>
+          <w:rtl w:val="0"/>
+        </w:rPr>
+        <w:t xml:space="preserve">Reach out to the development team for a fix</w:t>
+      </w:r>
+    </w:p>
+    <w:p>
+      <w:pPr>
+        <w:numPr>
+          <w:ilvl w:val="0"/>
+          <w:numId w:val="7"/>
+        </w:numPr>
+        <w:ind w:left="720" w:hanging="360"/>
+        <w:rPr/>
+      </w:pPr>
+      <w:r>
+        <w:rPr>
+          <w:rtl w:val="0"/>
+        </w:rPr>
+        <w:t xml:space="preserve">Invalid or Missing Date Selection:</w:t>
       </w:r>
     </w:p>
     <w:p>
@@ -3285,450 +3470,186 @@
         <w:ind w:left="1440" w:hanging="360"/>
         <w:rPr/>
       </w:pPr>
+      <w:r>
+        <w:rPr>
+          <w:rtl w:val="0"/>
+        </w:rPr>
+        <w:t xml:space="preserve">If the user clicks “Submit” without selecting a date, an alert is triggered. </w:t>
+      </w:r>
+    </w:p>
+    <w:p>
+      <w:pPr>
+        <w:numPr>
+          <w:ilvl w:val="1"/>
+          <w:numId w:val="7"/>
+        </w:numPr>
+        <w:ind w:left="1440" w:hanging="360"/>
+        <w:rPr/>
+      </w:pPr>
+      <w:r>
+        <w:rPr>
+          <w:rtl w:val="0"/>
+        </w:rPr>
+        <w:t xml:space="preserve">Common Causes:</w:t>
+      </w:r>
+    </w:p>
+    <w:p>
+      <w:pPr>
+        <w:numPr>
+          <w:ilvl w:val="2"/>
+          <w:numId w:val="7"/>
+        </w:numPr>
+        <w:ind w:left="2160" w:hanging="360"/>
+        <w:rPr/>
+      </w:pPr>
+      <w:r>
+        <w:rPr>
+          <w:rtl w:val="0"/>
+        </w:rPr>
+        <w:t xml:space="preserve">Date was not selected</w:t>
+      </w:r>
+    </w:p>
+    <w:p>
+      <w:pPr>
+        <w:numPr>
+          <w:ilvl w:val="1"/>
+          <w:numId w:val="7"/>
+        </w:numPr>
+        <w:ind w:left="1440" w:hanging="360"/>
+        <w:rPr/>
+      </w:pPr>
+      <w:r>
+        <w:rPr>
+          <w:rtl w:val="0"/>
+        </w:rPr>
+        <w:t xml:space="preserve">Troubleshooting steps:</w:t>
+      </w:r>
+    </w:p>
+    <w:p>
+      <w:pPr>
+        <w:numPr>
+          <w:ilvl w:val="2"/>
+          <w:numId w:val="7"/>
+        </w:numPr>
+        <w:ind w:left="2160" w:hanging="360"/>
+        <w:rPr/>
+      </w:pPr>
+      <w:r>
+        <w:rPr>
+          <w:rtl w:val="0"/>
+        </w:rPr>
+        <w:t xml:space="preserve">Ensure a date is selected in the calendar before submitting</w:t>
+      </w:r>
+    </w:p>
+    <w:p>
+      <w:pPr>
+        <w:numPr>
+          <w:ilvl w:val="2"/>
+          <w:numId w:val="7"/>
+        </w:numPr>
+        <w:ind w:left="2160" w:hanging="360"/>
+        <w:rPr/>
+      </w:pPr>
+      <w:r>
+        <w:rPr>
+          <w:rtl w:val="0"/>
+        </w:rPr>
+        <w:t xml:space="preserve">If the calendar is not rendering, check that calendar-picker.js is properly loaded in the web console</w:t>
+      </w:r>
+    </w:p>
+    <w:p>
+      <w:pPr>
+        <w:numPr>
+          <w:ilvl w:val="0"/>
+          <w:numId w:val="7"/>
+        </w:numPr>
+        <w:ind w:left="720" w:hanging="360"/>
+        <w:rPr/>
+      </w:pPr>
+      <w:r>
+        <w:rPr>
+          <w:rtl w:val="0"/>
+        </w:rPr>
+        <w:t xml:space="preserve">JavaScript Runtime Errors</w:t>
+      </w:r>
+    </w:p>
+    <w:p>
+      <w:pPr>
+        <w:numPr>
+          <w:ilvl w:val="1"/>
+          <w:numId w:val="7"/>
+        </w:numPr>
+        <w:ind w:left="1440" w:hanging="360"/>
+        <w:rPr/>
+      </w:pPr>
+      <w:r>
+        <w:rPr>
+          <w:rtl w:val="0"/>
+        </w:rPr>
+        <w:t xml:space="preserve">Errors such as missing DOM elements or undefined variables may appear in the browser console.</w:t>
+      </w:r>
+    </w:p>
+    <w:p>
+      <w:pPr>
+        <w:numPr>
+          <w:ilvl w:val="1"/>
+          <w:numId w:val="7"/>
+        </w:numPr>
+        <w:ind w:left="1440" w:hanging="360"/>
+        <w:rPr/>
+      </w:pPr>
+      <w:r>
+        <w:rPr>
+          <w:rtl w:val="0"/>
+        </w:rPr>
+        <w:t xml:space="preserve">Common Causes:</w:t>
+      </w:r>
+    </w:p>
+    <w:p>
+      <w:pPr>
+        <w:numPr>
+          <w:ilvl w:val="2"/>
+          <w:numId w:val="7"/>
+        </w:numPr>
+        <w:ind w:left="2160" w:hanging="360"/>
+        <w:rPr/>
+      </w:pPr>
+      <w:r>
+        <w:rPr>
+          <w:rtl w:val="0"/>
+        </w:rPr>
+        <w:t xml:space="preserve">Code Bugs</w:t>
+      </w:r>
+    </w:p>
+    <w:p>
+      <w:pPr>
+        <w:numPr>
+          <w:ilvl w:val="1"/>
+          <w:numId w:val="7"/>
+        </w:numPr>
+        <w:ind w:left="1440" w:hanging="360"/>
+        <w:rPr/>
+      </w:pPr>
+      <w:r>
+        <w:rPr>
+          <w:rtl w:val="0"/>
+        </w:rPr>
+        <w:t xml:space="preserve">Troubleshooting Tips: </w:t>
+      </w:r>
+    </w:p>
+    <w:p>
+      <w:pPr>
+        <w:numPr>
+          <w:ilvl w:val="2"/>
+          <w:numId w:val="7"/>
+        </w:numPr>
+        <w:ind w:left="2160" w:hanging="360"/>
+        <w:rPr/>
+      </w:pPr>
       <w:sdt>
         <w:sdtPr>
-          <w:id w:val="-539811536"/>
-          <w:tag w:val="goog_rdk_12"/>
-        </w:sdtPr>
-        <w:sdtContent>
-          <w:commentRangeStart w:id="11"/>
-        </w:sdtContent>
-      </w:sdt>
-      <w:r>
-        <w:rPr>
-          <w:rtl w:val="0"/>
-        </w:rPr>
-        <w:t xml:space="preserve">Troubleshooting Tips</w:t>
-      </w:r>
-      <w:commentRangeEnd w:id="11"/>
-      <w:r>
-        <w:commentReference w:id="11"/>
-      </w:r>
-      <w:r>
-        <w:rPr>
-          <w:rtl w:val="0"/>
-        </w:rPr>
-        <w:t xml:space="preserve">:</w:t>
-      </w:r>
-    </w:p>
-    <w:p>
-      <w:pPr>
-        <w:numPr>
-          <w:ilvl w:val="2"/>
-          <w:numId w:val="7"/>
-        </w:numPr>
-        <w:ind w:left="2160" w:hanging="360"/>
-        <w:rPr/>
-      </w:pPr>
-      <w:r>
-        <w:rPr>
-          <w:rtl w:val="0"/>
-        </w:rPr>
-        <w:t xml:space="preserve">Ensure OpenSpace is running</w:t>
-      </w:r>
-    </w:p>
-    <w:p>
-      <w:pPr>
-        <w:numPr>
-          <w:ilvl w:val="2"/>
-          <w:numId w:val="7"/>
-        </w:numPr>
-        <w:ind w:left="2160" w:hanging="360"/>
-        <w:rPr/>
-      </w:pPr>
-      <w:r>
-        <w:rPr>
-          <w:rtl w:val="0"/>
-        </w:rPr>
-        <w:t xml:space="preserve">Verify the IP address in the input field</w:t>
-      </w:r>
-    </w:p>
-    <w:p>
-      <w:pPr>
-        <w:numPr>
-          <w:ilvl w:val="2"/>
-          <w:numId w:val="7"/>
-        </w:numPr>
-        <w:ind w:left="2160" w:hanging="360"/>
-        <w:rPr/>
-      </w:pPr>
-      <w:r>
-        <w:rPr>
-          <w:rtl w:val="0"/>
-        </w:rPr>
-        <w:t xml:space="preserve">Refresh the page and reconnect using the “Connect” button</w:t>
-      </w:r>
-    </w:p>
-    <w:p>
-      <w:pPr>
-        <w:numPr>
-          <w:ilvl w:val="0"/>
-          <w:numId w:val="7"/>
-        </w:numPr>
-        <w:ind w:left="720" w:hanging="360"/>
-        <w:rPr/>
-      </w:pPr>
-      <w:r>
-        <w:rPr>
-          <w:rtl w:val="0"/>
-        </w:rPr>
-        <w:t xml:space="preserve">Tile Server Errors</w:t>
-      </w:r>
-    </w:p>
-    <w:p>
-      <w:pPr>
-        <w:numPr>
-          <w:ilvl w:val="1"/>
-          <w:numId w:val="7"/>
-        </w:numPr>
-        <w:ind w:left="1440" w:hanging="360"/>
-        <w:rPr/>
-      </w:pPr>
-      <w:r>
-        <w:rPr>
-          <w:rtl w:val="0"/>
-        </w:rPr>
-        <w:t xml:space="preserve">If tiles fail to load (blank image icon), the issue is usually with the Apache tile server.</w:t>
-      </w:r>
-    </w:p>
-    <w:p>
-      <w:pPr>
-        <w:numPr>
-          <w:ilvl w:val="1"/>
-          <w:numId w:val="7"/>
-        </w:numPr>
-        <w:ind w:left="1440" w:hanging="360"/>
-        <w:rPr/>
-      </w:pPr>
-      <w:r>
-        <w:rPr>
-          <w:rtl w:val="0"/>
-        </w:rPr>
-        <w:t xml:space="preserve">Common causes:</w:t>
-      </w:r>
-    </w:p>
-    <w:p>
-      <w:pPr>
-        <w:numPr>
-          <w:ilvl w:val="2"/>
-          <w:numId w:val="7"/>
-        </w:numPr>
-        <w:ind w:left="2160" w:hanging="360"/>
-        <w:rPr/>
-      </w:pPr>
-      <w:r>
-        <w:rPr>
-          <w:rtl w:val="0"/>
-        </w:rPr>
-        <w:t xml:space="preserve">Tile Server is down</w:t>
-      </w:r>
-    </w:p>
-    <w:p>
-      <w:pPr>
-        <w:numPr>
-          <w:ilvl w:val="2"/>
-          <w:numId w:val="7"/>
-        </w:numPr>
-        <w:ind w:left="2160" w:hanging="360"/>
-        <w:rPr/>
-      </w:pPr>
-      <w:r>
-        <w:rPr>
-          <w:rtl w:val="0"/>
-        </w:rPr>
-        <w:t xml:space="preserve">Software Bug</w:t>
-      </w:r>
-    </w:p>
-    <w:p>
-      <w:pPr>
-        <w:numPr>
-          <w:ilvl w:val="1"/>
-          <w:numId w:val="7"/>
-        </w:numPr>
-        <w:ind w:left="1440" w:hanging="360"/>
-        <w:rPr/>
-      </w:pPr>
-      <w:r>
-        <w:rPr>
-          <w:rtl w:val="0"/>
-        </w:rPr>
-        <w:t xml:space="preserve">Troubleshooting Tips:</w:t>
-      </w:r>
-    </w:p>
-    <w:p>
-      <w:pPr>
-        <w:numPr>
-          <w:ilvl w:val="2"/>
-          <w:numId w:val="7"/>
-        </w:numPr>
-        <w:ind w:left="2160" w:hanging="360"/>
-        <w:rPr/>
-      </w:pPr>
-      <w:sdt>
-        <w:sdtPr>
-          <w:id w:val="1348300685"/>
-          <w:tag w:val="goog_rdk_13"/>
-        </w:sdtPr>
-        <w:sdtContent>
-          <w:commentRangeStart w:id="12"/>
-        </w:sdtContent>
-      </w:sdt>
-      <w:r>
-        <w:rPr>
-          <w:rtl w:val="0"/>
-        </w:rPr>
-        <w:t xml:space="preserve">Reach out to the development team for a fix</w:t>
-      </w:r>
-    </w:p>
-    <w:p>
-      <w:pPr>
-        <w:numPr>
-          <w:ilvl w:val="2"/>
-          <w:numId w:val="7"/>
-        </w:numPr>
-        <w:ind w:left="2160" w:hanging="360"/>
-        <w:rPr>
-          <w:rFonts w:ascii="Arial" w:cs="Arial" w:eastAsia="Arial" w:hAnsi="Arial"/>
-          <w:u w:val="none"/>
-        </w:rPr>
-      </w:pPr>
-      <w:r>
-        <w:rPr>
-          <w:rtl w:val="0"/>
-        </w:rPr>
-        <w:t xml:space="preserve">Reach out to Sean Birkel for Umaine VM status (</w:t>
-      </w:r>
-      <w:hyperlink r:id="rId16">
-        <w:r>
-          <w:rPr>
-            <w:color w:val="1155cc"/>
-            <w:u w:val="single"/>
-            <w:rtl w:val="0"/>
-          </w:rPr>
-          <w:t xml:space="preserve">reanalyzer@gmail.com</w:t>
-        </w:r>
-      </w:hyperlink>
-      <w:r>
-        <w:rPr>
-          <w:rtl w:val="0"/>
-        </w:rPr>
-        <w:t xml:space="preserve">)</w:t>
-      </w:r>
-      <w:commentRangeEnd w:id="12"/>
-      <w:r>
-        <w:commentReference w:id="12"/>
-      </w:r>
-      <w:r>
-        <w:rPr>
-          <w:rtl w:val="0"/>
-        </w:rPr>
-      </w:r>
-    </w:p>
-    <w:p>
-      <w:pPr>
-        <w:numPr>
-          <w:ilvl w:val="0"/>
-          <w:numId w:val="7"/>
-        </w:numPr>
-        <w:ind w:left="720" w:hanging="360"/>
-        <w:rPr/>
-      </w:pPr>
-      <w:r>
-        <w:rPr>
-          <w:rtl w:val="0"/>
-        </w:rPr>
-        <w:t xml:space="preserve">Invalid or Missing Date Selection:</w:t>
-      </w:r>
-    </w:p>
-    <w:p>
-      <w:pPr>
-        <w:numPr>
-          <w:ilvl w:val="1"/>
-          <w:numId w:val="7"/>
-        </w:numPr>
-        <w:ind w:left="1440" w:hanging="360"/>
-        <w:rPr/>
-      </w:pPr>
-      <w:r>
-        <w:rPr>
-          <w:rtl w:val="0"/>
-        </w:rPr>
-        <w:t xml:space="preserve">If the user clicks “Submit” without selecting a date, an alert is triggered. </w:t>
-      </w:r>
-    </w:p>
-    <w:p>
-      <w:pPr>
-        <w:numPr>
-          <w:ilvl w:val="1"/>
-          <w:numId w:val="7"/>
-        </w:numPr>
-        <w:ind w:left="1440" w:hanging="360"/>
-        <w:rPr/>
-      </w:pPr>
-      <w:r>
-        <w:rPr>
-          <w:rtl w:val="0"/>
-        </w:rPr>
-        <w:t xml:space="preserve">Common Causes:</w:t>
-      </w:r>
-    </w:p>
-    <w:p>
-      <w:pPr>
-        <w:numPr>
-          <w:ilvl w:val="2"/>
-          <w:numId w:val="7"/>
-        </w:numPr>
-        <w:ind w:left="2160" w:hanging="360"/>
-        <w:rPr/>
-      </w:pPr>
-      <w:r>
-        <w:rPr>
-          <w:rtl w:val="0"/>
-        </w:rPr>
-        <w:t xml:space="preserve">Date was not selected</w:t>
-      </w:r>
-    </w:p>
-    <w:p>
-      <w:pPr>
-        <w:numPr>
-          <w:ilvl w:val="1"/>
-          <w:numId w:val="7"/>
-        </w:numPr>
-        <w:ind w:left="1440" w:hanging="360"/>
-        <w:rPr/>
-      </w:pPr>
-      <w:r>
-        <w:rPr>
-          <w:rtl w:val="0"/>
-        </w:rPr>
-        <w:t xml:space="preserve">Troubleshooting steps:</w:t>
-      </w:r>
-    </w:p>
-    <w:p>
-      <w:pPr>
-        <w:numPr>
-          <w:ilvl w:val="2"/>
-          <w:numId w:val="7"/>
-        </w:numPr>
-        <w:ind w:left="2160" w:hanging="360"/>
-        <w:rPr/>
-      </w:pPr>
-      <w:r>
-        <w:rPr>
-          <w:rtl w:val="0"/>
-        </w:rPr>
-        <w:t xml:space="preserve">Ensure a date is selected in the calendar before submitting</w:t>
-      </w:r>
-    </w:p>
-    <w:p>
-      <w:pPr>
-        <w:numPr>
-          <w:ilvl w:val="2"/>
-          <w:numId w:val="7"/>
-        </w:numPr>
-        <w:ind w:left="2160" w:hanging="360"/>
-        <w:rPr/>
-      </w:pPr>
-      <w:r>
-        <w:rPr>
-          <w:rtl w:val="0"/>
-        </w:rPr>
-        <w:t xml:space="preserve">If the calendar is not rendering, check that calendar-picker.js is properly loaded in the web console</w:t>
-      </w:r>
-    </w:p>
-    <w:p>
-      <w:pPr>
-        <w:numPr>
-          <w:ilvl w:val="0"/>
-          <w:numId w:val="7"/>
-        </w:numPr>
-        <w:ind w:left="720" w:hanging="360"/>
-        <w:rPr/>
-      </w:pPr>
-      <w:r>
-        <w:rPr>
-          <w:rtl w:val="0"/>
-        </w:rPr>
-        <w:t xml:space="preserve">JavaScript Runtime Errors</w:t>
-      </w:r>
-    </w:p>
-    <w:p>
-      <w:pPr>
-        <w:numPr>
-          <w:ilvl w:val="1"/>
-          <w:numId w:val="7"/>
-        </w:numPr>
-        <w:ind w:left="1440" w:hanging="360"/>
-        <w:rPr/>
-      </w:pPr>
-      <w:r>
-        <w:rPr>
-          <w:rtl w:val="0"/>
-        </w:rPr>
-        <w:t xml:space="preserve">Errors such as missing DOM elements or undefined variables may appear in the browser console.</w:t>
-      </w:r>
-    </w:p>
-    <w:p>
-      <w:pPr>
-        <w:numPr>
-          <w:ilvl w:val="1"/>
-          <w:numId w:val="7"/>
-        </w:numPr>
-        <w:ind w:left="1440" w:hanging="360"/>
-        <w:rPr/>
-      </w:pPr>
-      <w:r>
-        <w:rPr>
-          <w:rtl w:val="0"/>
-        </w:rPr>
-        <w:t xml:space="preserve">Common Causes:</w:t>
-      </w:r>
-    </w:p>
-    <w:p>
-      <w:pPr>
-        <w:numPr>
-          <w:ilvl w:val="2"/>
-          <w:numId w:val="7"/>
-        </w:numPr>
-        <w:ind w:left="2160" w:hanging="360"/>
-        <w:rPr/>
-      </w:pPr>
-      <w:r>
-        <w:rPr>
-          <w:rtl w:val="0"/>
-        </w:rPr>
-        <w:t xml:space="preserve">Code Bugs</w:t>
-      </w:r>
-    </w:p>
-    <w:p>
-      <w:pPr>
-        <w:numPr>
-          <w:ilvl w:val="1"/>
-          <w:numId w:val="7"/>
-        </w:numPr>
-        <w:ind w:left="1440" w:hanging="360"/>
-        <w:rPr/>
-      </w:pPr>
-      <w:r>
-        <w:rPr>
-          <w:rtl w:val="0"/>
-        </w:rPr>
-        <w:t xml:space="preserve">Troubleshooting Tips: </w:t>
-      </w:r>
-    </w:p>
-    <w:p>
-      <w:pPr>
-        <w:numPr>
-          <w:ilvl w:val="2"/>
-          <w:numId w:val="7"/>
-        </w:numPr>
-        <w:ind w:left="2160" w:hanging="360"/>
-        <w:rPr/>
-      </w:pPr>
-      <w:sdt>
-        <w:sdtPr>
-          <w:id w:val="-414704906"/>
-          <w:tag w:val="goog_rdk_14"/>
+          <w:id w:val="-1130444393"/>
+          <w:tag w:val="goog_rdk_3"/>
         </w:sdtPr>
         <w:sdtContent>
           <w:r>
@@ -3799,8 +3720,8 @@
         <w:pStyle w:val="Heading2"/>
         <w:rPr/>
       </w:pPr>
-      <w:bookmarkStart w:colFirst="0" w:colLast="0" w:name="_heading=h.v5byvlqcxtjf" w:id="13"/>
-      <w:bookmarkEnd w:id="13"/>
+      <w:bookmarkStart w:colFirst="0" w:colLast="0" w:name="_heading=h.v5byvlqcxtjf" w:id="14"/>
+      <w:bookmarkEnd w:id="14"/>
       <w:r>
         <w:rPr>
           <w:rtl w:val="0"/>
@@ -3874,7 +3795,7 @@
         </w:rPr>
         <w:t xml:space="preserve">Location: submitDate() in </w:t>
       </w:r>
-      <w:hyperlink r:id="rId17">
+      <w:hyperlink r:id="rId16">
         <w:r>
           <w:rPr>
             <w:color w:val="1155cc"/>
@@ -3925,7 +3846,7 @@
         </w:rPr>
         <w:t xml:space="preserve">baseUrl = "</w:t>
       </w:r>
-      <w:hyperlink r:id="rId18">
+      <w:hyperlink r:id="rId17">
         <w:r>
           <w:rPr>
             <w:color w:val="1155cc"/>
@@ -4211,7 +4132,7 @@
         </w:rPr>
         <w:t xml:space="preserve">Location: </w:t>
       </w:r>
-      <w:hyperlink r:id="rId19">
+      <w:hyperlink r:id="rId18">
         <w:r>
           <w:rPr>
             <w:color w:val="1155cc"/>
@@ -4330,11 +4251,11 @@
       </w:pPr>
       <w:sdt>
         <w:sdtPr>
-          <w:id w:val="-741286606"/>
-          <w:tag w:val="goog_rdk_15"/>
+          <w:id w:val="252806123"/>
+          <w:tag w:val="goog_rdk_4"/>
         </w:sdtPr>
         <w:sdtContent>
-          <w:commentRangeStart w:id="13"/>
+          <w:commentRangeStart w:id="2"/>
         </w:sdtContent>
       </w:sdt>
       <w:r>
@@ -4343,9 +4264,9 @@
         </w:rPr>
         <w:t xml:space="preserve">Reason not fixed</w:t>
       </w:r>
-      <w:commentRangeEnd w:id="13"/>
-      <w:r>
-        <w:commentReference w:id="13"/>
+      <w:commentRangeEnd w:id="2"/>
+      <w:r>
+        <w:commentReference w:id="2"/>
       </w:r>
       <w:r>
         <w:rPr>
@@ -4708,138 +4629,8 @@
           <w:rFonts w:ascii="Times New Roman" w:cs="Times New Roman" w:eastAsia="Times New Roman" w:hAnsi="Times New Roman"/>
         </w:rPr>
       </w:pPr>
-      <w:bookmarkStart w:colFirst="0" w:colLast="0" w:name="_heading=h.e4g9k3vnuwrt" w:id="14"/>
-      <w:bookmarkEnd w:id="14"/>
-      <w:r>
-        <w:rPr>
-          <w:rtl w:val="0"/>
-        </w:rPr>
-      </w:r>
-    </w:p>
-    <w:p>
-      <w:pPr>
-        <w:rPr/>
-      </w:pPr>
-      <w:r>
-        <w:rPr>
-          <w:rtl w:val="0"/>
-        </w:rPr>
-      </w:r>
-    </w:p>
-    <w:p>
-      <w:pPr>
-        <w:rPr/>
-      </w:pPr>
-      <w:r>
-        <w:rPr>
-          <w:rtl w:val="0"/>
-        </w:rPr>
-      </w:r>
-    </w:p>
-    <w:p>
-      <w:pPr>
-        <w:rPr/>
-      </w:pPr>
-      <w:r>
-        <w:rPr>
-          <w:rtl w:val="0"/>
-        </w:rPr>
-      </w:r>
-    </w:p>
-    <w:p>
-      <w:pPr>
-        <w:rPr/>
-      </w:pPr>
-      <w:r>
-        <w:rPr>
-          <w:rtl w:val="0"/>
-        </w:rPr>
-      </w:r>
-    </w:p>
-    <w:p>
-      <w:pPr>
-        <w:rPr/>
-      </w:pPr>
-      <w:r>
-        <w:rPr>
-          <w:rtl w:val="0"/>
-        </w:rPr>
-      </w:r>
-    </w:p>
-    <w:p>
-      <w:pPr>
-        <w:rPr/>
-      </w:pPr>
-      <w:r>
-        <w:rPr>
-          <w:rtl w:val="0"/>
-        </w:rPr>
-      </w:r>
-    </w:p>
-    <w:p>
-      <w:pPr>
-        <w:rPr/>
-      </w:pPr>
-      <w:r>
-        <w:rPr>
-          <w:rtl w:val="0"/>
-        </w:rPr>
-      </w:r>
-    </w:p>
-    <w:p>
-      <w:pPr>
-        <w:rPr/>
-      </w:pPr>
-      <w:r>
-        <w:rPr>
-          <w:rtl w:val="0"/>
-        </w:rPr>
-      </w:r>
-    </w:p>
-    <w:p>
-      <w:pPr>
-        <w:rPr/>
-      </w:pPr>
-      <w:r>
-        <w:rPr>
-          <w:rtl w:val="0"/>
-        </w:rPr>
-      </w:r>
-    </w:p>
-    <w:p>
-      <w:pPr>
-        <w:rPr/>
-      </w:pPr>
-      <w:r>
-        <w:rPr>
-          <w:rtl w:val="0"/>
-        </w:rPr>
-      </w:r>
-    </w:p>
-    <w:p>
-      <w:pPr>
-        <w:rPr/>
-      </w:pPr>
-      <w:r>
-        <w:rPr>
-          <w:rtl w:val="0"/>
-        </w:rPr>
-      </w:r>
-    </w:p>
-    <w:p>
-      <w:pPr>
-        <w:rPr/>
-      </w:pPr>
-      <w:r>
-        <w:rPr>
-          <w:rtl w:val="0"/>
-        </w:rPr>
-      </w:r>
-    </w:p>
-    <w:p>
-      <w:pPr>
-        <w:rPr/>
-      </w:pPr>
+      <w:bookmarkStart w:colFirst="0" w:colLast="0" w:name="_heading=h.e4g9k3vnuwrt" w:id="15"/>
+      <w:bookmarkEnd w:id="15"/>
       <w:r>
         <w:rPr>
           <w:rtl w:val="0"/>
@@ -5023,8 +4814,8 @@
           <w:rFonts w:ascii="Times New Roman" w:cs="Times New Roman" w:eastAsia="Times New Roman" w:hAnsi="Times New Roman"/>
         </w:rPr>
       </w:pPr>
-      <w:bookmarkStart w:colFirst="0" w:colLast="0" w:name="_heading=h.la44mmu0k5a" w:id="15"/>
-      <w:bookmarkEnd w:id="15"/>
+      <w:bookmarkStart w:colFirst="0" w:colLast="0" w:name="_heading=h.la44mmu0k5a" w:id="16"/>
+      <w:bookmarkEnd w:id="16"/>
       <w:r>
         <w:rPr>
           <w:rFonts w:ascii="Times New Roman" w:cs="Times New Roman" w:eastAsia="Times New Roman" w:hAnsi="Times New Roman"/>
@@ -5115,11 +4906,11 @@
       </w:pPr>
       <w:sdt>
         <w:sdtPr>
-          <w:id w:val="966313789"/>
-          <w:tag w:val="goog_rdk_16"/>
+          <w:id w:val="-795743031"/>
+          <w:tag w:val="goog_rdk_5"/>
         </w:sdtPr>
         <w:sdtContent>
-          <w:commentRangeStart w:id="14"/>
+          <w:commentRangeStart w:id="3"/>
         </w:sdtContent>
       </w:sdt>
       <w:r>
@@ -5132,9 +4923,9 @@
         </w:rPr>
         <w:t xml:space="preserve">Signed</w:t>
       </w:r>
-      <w:commentRangeEnd w:id="14"/>
-      <w:r>
-        <w:commentReference w:id="14"/>
+      <w:commentRangeEnd w:id="3"/>
+      <w:r>
+        <w:commentReference w:id="3"/>
       </w:r>
       <w:r>
         <w:rPr>
@@ -5203,7 +4994,7 @@
         <w:tab/>
         <w:tab/>
         <w:tab/>
-        <w:t xml:space="preserve">  Date: 03/25/2026</w:t>
+        <w:t xml:space="preserve">  Date: 04/15/2026</w:t>
       </w:r>
       <w:r>
         <w:rPr>
@@ -5301,7 +5092,7 @@
         <w:tab/>
         <w:tab/>
         <w:tab/>
-        <w:t xml:space="preserve">  Date: 03/25/2026</w:t>
+        <w:t xml:space="preserve">  Date: 04/15/2026</w:t>
       </w:r>
       <w:r>
         <w:rPr>
@@ -5399,7 +5190,7 @@
         <w:tab/>
         <w:tab/>
         <w:tab/>
-        <w:t xml:space="preserve">  Date: 03/25/2026</w:t>
+        <w:t xml:space="preserve">  Date: 04/15/2026</w:t>
       </w:r>
       <w:r>
         <w:rPr>
@@ -5497,7 +5288,7 @@
         <w:tab/>
         <w:tab/>
         <w:tab/>
-        <w:t xml:space="preserve"> Date: 03/25/2026</w:t>
+        <w:t xml:space="preserve"> Date: 04/15/2026</w:t>
       </w:r>
       <w:r>
         <w:rPr>
@@ -5613,7 +5404,7 @@
           <w:szCs w:val="22"/>
           <w:rtl w:val="0"/>
         </w:rPr>
-        <w:t xml:space="preserve">  Date: 03/25/2026</w:t>
+        <w:t xml:space="preserve">  Date: 04/15/2026</w:t>
       </w:r>
       <w:r>
         <w:rPr>
@@ -5676,14 +5467,634 @@
           <w:rFonts w:ascii="Times New Roman" w:cs="Times New Roman" w:eastAsia="Times New Roman" w:hAnsi="Times New Roman"/>
         </w:rPr>
       </w:pPr>
-      <w:bookmarkStart w:colFirst="0" w:colLast="0" w:name="_heading=h.20v7p51yjpsw" w:id="16"/>
-      <w:bookmarkEnd w:id="16"/>
+      <w:bookmarkStart w:colFirst="0" w:colLast="0" w:name="_heading=h.eltaa81deuo2" w:id="17"/>
+      <w:bookmarkEnd w:id="17"/>
       <w:r>
         <w:rPr>
           <w:rFonts w:ascii="Times New Roman" w:cs="Times New Roman" w:eastAsia="Times New Roman" w:hAnsi="Times New Roman"/>
           <w:rtl w:val="0"/>
         </w:rPr>
-        <w:t xml:space="preserve">Appendix B – Document Contributions</w:t>
+        <w:t xml:space="preserve">Appendix B – Client Review Sign-off</w:t>
+      </w:r>
+    </w:p>
+    <w:p>
+      <w:pPr>
+        <w:rPr/>
+      </w:pPr>
+      <w:r>
+        <w:rPr>
+          <w:rtl w:val="0"/>
+        </w:rPr>
+      </w:r>
+    </w:p>
+    <w:p>
+      <w:pPr>
+        <w:spacing w:line="276" w:lineRule="auto"/>
+        <w:ind w:firstLine="720"/>
+        <w:rPr>
+          <w:sz w:val="22"/>
+          <w:szCs w:val="22"/>
+        </w:rPr>
+      </w:pPr>
+      <w:r>
+        <w:rPr>
+          <w:sz w:val="22"/>
+          <w:szCs w:val="22"/>
+          <w:rtl w:val="0"/>
+        </w:rPr>
+        <w:t xml:space="preserve">We, the team at V-Model Violets, all agree and sign off on all the information provided in this document. The document has been reviewed by all members, and we agree on its content, and it is formatted in a way we all agree on. No one in the team has any major issues with the document or its layout. Any minor issues may be listed in the comments below.</w:t>
+      </w:r>
+    </w:p>
+    <w:p>
+      <w:pPr>
+        <w:spacing w:line="276" w:lineRule="auto"/>
+        <w:ind w:firstLine="720"/>
+        <w:rPr>
+          <w:sz w:val="22"/>
+          <w:szCs w:val="22"/>
+        </w:rPr>
+      </w:pPr>
+      <w:r>
+        <w:rPr>
+          <w:rtl w:val="0"/>
+        </w:rPr>
+      </w:r>
+    </w:p>
+    <w:p>
+      <w:pPr>
+        <w:spacing w:line="276" w:lineRule="auto"/>
+        <w:jc w:val="center"/>
+        <w:rPr>
+          <w:b w:val="1"/>
+          <w:bCs w:val="1"/>
+          <w:sz w:val="32"/>
+          <w:szCs w:val="32"/>
+        </w:rPr>
+      </w:pPr>
+      <w:sdt>
+        <w:sdtPr>
+          <w:id w:val="1374491978"/>
+          <w:tag w:val="goog_rdk_6"/>
+        </w:sdtPr>
+        <w:sdtContent>
+          <w:commentRangeStart w:id="4"/>
+        </w:sdtContent>
+      </w:sdt>
+      <w:r>
+        <w:rPr>
+          <w:b w:val="1"/>
+          <w:bCs w:val="1"/>
+          <w:sz w:val="32"/>
+          <w:szCs w:val="32"/>
+          <w:rtl w:val="0"/>
+        </w:rPr>
+        <w:t xml:space="preserve">Signed</w:t>
+      </w:r>
+      <w:commentRangeEnd w:id="4"/>
+      <w:r>
+        <w:commentReference w:id="4"/>
+      </w:r>
+      <w:r>
+        <w:rPr>
+          <w:rtl w:val="0"/>
+        </w:rPr>
+      </w:r>
+    </w:p>
+    <w:p>
+      <w:pPr>
+        <w:spacing w:line="276" w:lineRule="auto"/>
+        <w:jc w:val="center"/>
+        <w:rPr>
+          <w:b w:val="1"/>
+          <w:bCs w:val="1"/>
+          <w:sz w:val="32"/>
+          <w:szCs w:val="32"/>
+        </w:rPr>
+      </w:pPr>
+      <w:r>
+        <w:rPr>
+          <w:rtl w:val="0"/>
+        </w:rPr>
+      </w:r>
+    </w:p>
+    <w:p>
+      <w:pPr>
+        <w:spacing w:line="276" w:lineRule="auto"/>
+        <w:rPr/>
+      </w:pPr>
+      <w:r>
+        <w:rPr>
+          <w:b w:val="1"/>
+          <w:bCs w:val="1"/>
+          <w:sz w:val="22"/>
+          <w:szCs w:val="22"/>
+          <w:rtl w:val="0"/>
+        </w:rPr>
+        <w:t xml:space="preserve">Sean Birkel: </w:t>
+        <w:tab/>
+        <w:tab/>
+        <w:tab/>
+        <w:tab/>
+        <w:tab/>
+        <w:tab/>
+        <w:tab/>
+        <w:tab/>
+        <w:t xml:space="preserve">  Date: </w:t>
+      </w:r>
+      <w:r>
+        <w:rPr>
+          <w:rtl w:val="0"/>
+        </w:rPr>
+      </w:r>
+    </w:p>
+    <w:p>
+      <w:pPr>
+        <w:spacing w:line="276" w:lineRule="auto"/>
+        <w:rPr>
+          <w:b w:val="1"/>
+          <w:bCs w:val="1"/>
+          <w:sz w:val="22"/>
+          <w:szCs w:val="22"/>
+        </w:rPr>
+      </w:pPr>
+      <w:r>
+        <w:rPr>
+          <w:rtl w:val="0"/>
+        </w:rPr>
+      </w:r>
+    </w:p>
+    <w:p>
+      <w:pPr>
+        <w:spacing w:line="276" w:lineRule="auto"/>
+        <w:rPr>
+          <w:b w:val="1"/>
+          <w:bCs w:val="1"/>
+          <w:sz w:val="22"/>
+          <w:szCs w:val="22"/>
+        </w:rPr>
+      </w:pPr>
+      <w:r>
+        <w:rPr>
+          <w:b w:val="1"/>
+          <w:bCs w:val="1"/>
+          <w:sz w:val="22"/>
+          <w:szCs w:val="22"/>
+          <w:rtl w:val="0"/>
+        </w:rPr>
+        <w:t xml:space="preserve">Comments:______________________________________________________________________________________________________________________________________________</w:t>
+      </w:r>
+    </w:p>
+    <w:p>
+      <w:pPr>
+        <w:spacing w:line="276" w:lineRule="auto"/>
+        <w:rPr>
+          <w:b w:val="1"/>
+          <w:bCs w:val="1"/>
+          <w:sz w:val="22"/>
+          <w:szCs w:val="22"/>
+        </w:rPr>
+      </w:pPr>
+      <w:r>
+        <w:rPr>
+          <w:rtl w:val="0"/>
+        </w:rPr>
+      </w:r>
+    </w:p>
+    <w:p>
+      <w:pPr>
+        <w:spacing w:line="276" w:lineRule="auto"/>
+        <w:rPr>
+          <w:b w:val="1"/>
+          <w:bCs w:val="1"/>
+          <w:sz w:val="22"/>
+          <w:szCs w:val="22"/>
+        </w:rPr>
+      </w:pPr>
+      <w:r>
+        <w:rPr>
+          <w:rtl w:val="0"/>
+        </w:rPr>
+      </w:r>
+    </w:p>
+    <w:p>
+      <w:pPr>
+        <w:spacing w:line="276" w:lineRule="auto"/>
+        <w:rPr/>
+      </w:pPr>
+      <w:r>
+        <w:rPr>
+          <w:b w:val="1"/>
+          <w:bCs w:val="1"/>
+          <w:sz w:val="22"/>
+          <w:szCs w:val="22"/>
+          <w:rtl w:val="0"/>
+        </w:rPr>
+        <w:t xml:space="preserve">Micah Acinapura: </w:t>
+        <w:tab/>
+        <w:tab/>
+        <w:tab/>
+        <w:tab/>
+        <w:tab/>
+        <w:tab/>
+        <w:tab/>
+        <w:t xml:space="preserve">  Date: </w:t>
+      </w:r>
+      <w:r>
+        <w:rPr>
+          <w:rtl w:val="0"/>
+        </w:rPr>
+      </w:r>
+    </w:p>
+    <w:p>
+      <w:pPr>
+        <w:spacing w:line="276" w:lineRule="auto"/>
+        <w:rPr>
+          <w:b w:val="1"/>
+          <w:bCs w:val="1"/>
+          <w:sz w:val="22"/>
+          <w:szCs w:val="22"/>
+        </w:rPr>
+      </w:pPr>
+      <w:r>
+        <w:rPr>
+          <w:rtl w:val="0"/>
+        </w:rPr>
+      </w:r>
+    </w:p>
+    <w:p>
+      <w:pPr>
+        <w:spacing w:line="276" w:lineRule="auto"/>
+        <w:rPr>
+          <w:b w:val="1"/>
+          <w:bCs w:val="1"/>
+          <w:sz w:val="22"/>
+          <w:szCs w:val="22"/>
+        </w:rPr>
+      </w:pPr>
+      <w:r>
+        <w:rPr>
+          <w:b w:val="1"/>
+          <w:bCs w:val="1"/>
+          <w:sz w:val="22"/>
+          <w:szCs w:val="22"/>
+          <w:rtl w:val="0"/>
+        </w:rPr>
+        <w:t xml:space="preserve">Comments:______________________________________________________________________________________________________________________________________________</w:t>
+      </w:r>
+    </w:p>
+    <w:p>
+      <w:pPr>
+        <w:spacing w:line="276" w:lineRule="auto"/>
+        <w:rPr>
+          <w:b w:val="1"/>
+          <w:bCs w:val="1"/>
+          <w:sz w:val="22"/>
+          <w:szCs w:val="22"/>
+        </w:rPr>
+      </w:pPr>
+      <w:r>
+        <w:rPr>
+          <w:rtl w:val="0"/>
+        </w:rPr>
+      </w:r>
+    </w:p>
+    <w:p>
+      <w:pPr>
+        <w:spacing w:line="276" w:lineRule="auto"/>
+        <w:rPr>
+          <w:b w:val="1"/>
+          <w:bCs w:val="1"/>
+          <w:sz w:val="22"/>
+          <w:szCs w:val="22"/>
+        </w:rPr>
+      </w:pPr>
+      <w:r>
+        <w:rPr>
+          <w:rtl w:val="0"/>
+        </w:rPr>
+      </w:r>
+    </w:p>
+    <w:p>
+      <w:pPr>
+        <w:spacing w:line="276" w:lineRule="auto"/>
+        <w:rPr/>
+      </w:pPr>
+      <w:r>
+        <w:rPr>
+          <w:b w:val="1"/>
+          <w:bCs w:val="1"/>
+          <w:sz w:val="22"/>
+          <w:szCs w:val="22"/>
+          <w:rtl w:val="0"/>
+        </w:rPr>
+        <w:t xml:space="preserve">Shawn Laatsch: </w:t>
+        <w:tab/>
+        <w:tab/>
+        <w:tab/>
+        <w:tab/>
+        <w:tab/>
+        <w:tab/>
+        <w:tab/>
+        <w:t xml:space="preserve">  Date: </w:t>
+      </w:r>
+      <w:r>
+        <w:rPr>
+          <w:rtl w:val="0"/>
+        </w:rPr>
+      </w:r>
+    </w:p>
+    <w:p>
+      <w:pPr>
+        <w:spacing w:line="276" w:lineRule="auto"/>
+        <w:rPr>
+          <w:b w:val="1"/>
+          <w:bCs w:val="1"/>
+          <w:sz w:val="22"/>
+          <w:szCs w:val="22"/>
+        </w:rPr>
+      </w:pPr>
+      <w:r>
+        <w:rPr>
+          <w:rtl w:val="0"/>
+        </w:rPr>
+      </w:r>
+    </w:p>
+    <w:p>
+      <w:pPr>
+        <w:spacing w:line="276" w:lineRule="auto"/>
+        <w:rPr>
+          <w:b w:val="1"/>
+          <w:bCs w:val="1"/>
+          <w:sz w:val="22"/>
+          <w:szCs w:val="22"/>
+        </w:rPr>
+      </w:pPr>
+      <w:r>
+        <w:rPr>
+          <w:b w:val="1"/>
+          <w:bCs w:val="1"/>
+          <w:sz w:val="22"/>
+          <w:szCs w:val="22"/>
+          <w:rtl w:val="0"/>
+        </w:rPr>
+        <w:t xml:space="preserve">Comments:______________________________________________________________________________________________________________________________________________</w:t>
+      </w:r>
+    </w:p>
+    <w:p>
+      <w:pPr>
+        <w:spacing w:line="276" w:lineRule="auto"/>
+        <w:rPr>
+          <w:b w:val="1"/>
+          <w:bCs w:val="1"/>
+          <w:sz w:val="22"/>
+          <w:szCs w:val="22"/>
+        </w:rPr>
+      </w:pPr>
+      <w:r>
+        <w:rPr>
+          <w:rtl w:val="0"/>
+        </w:rPr>
+      </w:r>
+    </w:p>
+    <w:p>
+      <w:pPr>
+        <w:spacing w:line="276" w:lineRule="auto"/>
+        <w:rPr>
+          <w:b w:val="1"/>
+          <w:bCs w:val="1"/>
+          <w:sz w:val="22"/>
+          <w:szCs w:val="22"/>
+        </w:rPr>
+      </w:pPr>
+      <w:r>
+        <w:rPr>
+          <w:rtl w:val="0"/>
+        </w:rPr>
+      </w:r>
+    </w:p>
+    <w:p>
+      <w:pPr>
+        <w:spacing w:line="276" w:lineRule="auto"/>
+        <w:rPr>
+          <w:b w:val="1"/>
+          <w:bCs w:val="1"/>
+          <w:sz w:val="22"/>
+          <w:szCs w:val="22"/>
+        </w:rPr>
+      </w:pPr>
+      <w:r>
+        <w:rPr>
+          <w:rtl w:val="0"/>
+        </w:rPr>
+      </w:r>
+    </w:p>
+    <w:p>
+      <w:pPr>
+        <w:spacing w:line="276" w:lineRule="auto"/>
+        <w:rPr>
+          <w:b w:val="1"/>
+          <w:bCs w:val="1"/>
+          <w:sz w:val="22"/>
+          <w:szCs w:val="22"/>
+        </w:rPr>
+      </w:pPr>
+      <w:r>
+        <w:rPr>
+          <w:rtl w:val="0"/>
+        </w:rPr>
+      </w:r>
+    </w:p>
+    <w:p>
+      <w:pPr>
+        <w:spacing w:line="276" w:lineRule="auto"/>
+        <w:rPr>
+          <w:b w:val="1"/>
+          <w:bCs w:val="1"/>
+          <w:sz w:val="22"/>
+          <w:szCs w:val="22"/>
+        </w:rPr>
+      </w:pPr>
+      <w:r>
+        <w:rPr>
+          <w:rtl w:val="0"/>
+        </w:rPr>
+      </w:r>
+    </w:p>
+    <w:p>
+      <w:pPr>
+        <w:spacing w:line="276" w:lineRule="auto"/>
+        <w:rPr>
+          <w:b w:val="1"/>
+          <w:bCs w:val="1"/>
+          <w:sz w:val="22"/>
+          <w:szCs w:val="22"/>
+        </w:rPr>
+      </w:pPr>
+      <w:r>
+        <w:rPr>
+          <w:rtl w:val="0"/>
+        </w:rPr>
+      </w:r>
+    </w:p>
+    <w:p>
+      <w:pPr>
+        <w:spacing w:line="276" w:lineRule="auto"/>
+        <w:rPr>
+          <w:b w:val="1"/>
+          <w:bCs w:val="1"/>
+          <w:sz w:val="22"/>
+          <w:szCs w:val="22"/>
+        </w:rPr>
+      </w:pPr>
+      <w:r>
+        <w:rPr>
+          <w:rtl w:val="0"/>
+        </w:rPr>
+      </w:r>
+    </w:p>
+    <w:p>
+      <w:pPr>
+        <w:spacing w:line="276" w:lineRule="auto"/>
+        <w:rPr>
+          <w:b w:val="1"/>
+          <w:bCs w:val="1"/>
+          <w:sz w:val="22"/>
+          <w:szCs w:val="22"/>
+        </w:rPr>
+      </w:pPr>
+      <w:r>
+        <w:rPr>
+          <w:rtl w:val="0"/>
+        </w:rPr>
+      </w:r>
+    </w:p>
+    <w:p>
+      <w:pPr>
+        <w:spacing w:line="276" w:lineRule="auto"/>
+        <w:rPr>
+          <w:b w:val="1"/>
+          <w:bCs w:val="1"/>
+          <w:sz w:val="22"/>
+          <w:szCs w:val="22"/>
+        </w:rPr>
+      </w:pPr>
+      <w:r>
+        <w:rPr>
+          <w:rtl w:val="0"/>
+        </w:rPr>
+      </w:r>
+    </w:p>
+    <w:p>
+      <w:pPr>
+        <w:spacing w:line="276" w:lineRule="auto"/>
+        <w:rPr>
+          <w:b w:val="1"/>
+          <w:bCs w:val="1"/>
+          <w:sz w:val="22"/>
+          <w:szCs w:val="22"/>
+        </w:rPr>
+      </w:pPr>
+      <w:r>
+        <w:rPr>
+          <w:rtl w:val="0"/>
+        </w:rPr>
+      </w:r>
+    </w:p>
+    <w:p>
+      <w:pPr>
+        <w:spacing w:line="276" w:lineRule="auto"/>
+        <w:rPr>
+          <w:b w:val="1"/>
+          <w:bCs w:val="1"/>
+          <w:sz w:val="22"/>
+          <w:szCs w:val="22"/>
+        </w:rPr>
+      </w:pPr>
+      <w:r>
+        <w:rPr>
+          <w:rtl w:val="0"/>
+        </w:rPr>
+      </w:r>
+    </w:p>
+    <w:p>
+      <w:pPr>
+        <w:spacing w:line="276" w:lineRule="auto"/>
+        <w:rPr>
+          <w:b w:val="1"/>
+          <w:bCs w:val="1"/>
+          <w:sz w:val="22"/>
+          <w:szCs w:val="22"/>
+        </w:rPr>
+      </w:pPr>
+      <w:r>
+        <w:rPr>
+          <w:rtl w:val="0"/>
+        </w:rPr>
+      </w:r>
+    </w:p>
+    <w:p>
+      <w:pPr>
+        <w:spacing w:line="276" w:lineRule="auto"/>
+        <w:rPr>
+          <w:b w:val="1"/>
+          <w:bCs w:val="1"/>
+          <w:sz w:val="22"/>
+          <w:szCs w:val="22"/>
+        </w:rPr>
+      </w:pPr>
+      <w:r>
+        <w:rPr>
+          <w:rtl w:val="0"/>
+        </w:rPr>
+      </w:r>
+    </w:p>
+    <w:p>
+      <w:pPr>
+        <w:spacing w:line="276" w:lineRule="auto"/>
+        <w:rPr>
+          <w:b w:val="1"/>
+          <w:bCs w:val="1"/>
+          <w:sz w:val="22"/>
+          <w:szCs w:val="22"/>
+        </w:rPr>
+      </w:pPr>
+      <w:r>
+        <w:rPr>
+          <w:rtl w:val="0"/>
+        </w:rPr>
+      </w:r>
+    </w:p>
+    <w:p>
+      <w:pPr>
+        <w:spacing w:line="276" w:lineRule="auto"/>
+        <w:rPr>
+          <w:b w:val="1"/>
+          <w:bCs w:val="1"/>
+          <w:sz w:val="22"/>
+          <w:szCs w:val="22"/>
+        </w:rPr>
+      </w:pPr>
+      <w:r>
+        <w:rPr>
+          <w:rtl w:val="0"/>
+        </w:rPr>
+      </w:r>
+    </w:p>
+    <w:p>
+      <w:pPr>
+        <w:pStyle w:val="Heading1"/>
+        <w:rPr>
+          <w:rFonts w:ascii="Times New Roman" w:cs="Times New Roman" w:eastAsia="Times New Roman" w:hAnsi="Times New Roman"/>
+        </w:rPr>
+      </w:pPr>
+      <w:bookmarkStart w:colFirst="0" w:colLast="0" w:name="_heading=h.20v7p51yjpsw" w:id="18"/>
+      <w:bookmarkEnd w:id="18"/>
+      <w:r>
+        <w:rPr>
+          <w:rFonts w:ascii="Times New Roman" w:cs="Times New Roman" w:eastAsia="Times New Roman" w:hAnsi="Times New Roman"/>
+          <w:rtl w:val="0"/>
+        </w:rPr>
+        <w:t xml:space="preserve">Appendix C – Document Contributions</w:t>
       </w:r>
     </w:p>
     <w:p>
@@ -5939,8 +6350,8 @@
       </w:r>
     </w:p>
     <w:sectPr>
-      <w:footerReference r:id="rId20" w:type="default"/>
-      <w:footerReference r:id="rId21" w:type="even"/>
+      <w:footerReference r:id="rId19" w:type="default"/>
+      <w:footerReference r:id="rId20" w:type="even"/>
       <w:pgSz w:h="15840" w:w="12240" w:orient="portrait"/>
       <w:pgMar w:bottom="1440" w:top="1440" w:left="1440" w:right="1440" w:header="720" w:footer="720"/>
       <w:pgNumType w:start="1"/>
@@ -6006,7 +6417,7 @@
       </w:r>
     </w:p>
   </w:comment>
-  <w:comment w:author="Brianna Gannett" w:id="14" w:date="2026-03-26T00:53:37Z">
+  <w:comment w:author="Brianna Gannett" w:id="3" w:date="2026-03-26T00:53:37Z">
     <w:p>
       <w:pPr>
         <w:keepNext w:val="0"/>
@@ -6061,7 +6472,7 @@
       </w:r>
     </w:p>
   </w:comment>
-  <w:comment w:author="Caleb Corlett" w:id="11" w:date="2026-04-04T20:16:43Z">
+  <w:comment w:author="Brianna Gannett" w:id="4" w:date="2026-03-26T00:53:37Z">
     <w:p>
       <w:pPr>
         <w:keepNext w:val="0"/>
@@ -6112,11 +6523,11 @@
           <w:vertAlign w:val="baseline"/>
           <w:rtl w:val="0"/>
         </w:rPr>
-        <w:t xml:space="preserve">Images would be helpful to convey what the admin needs to do / look for.</w:t>
+        <w:t xml:space="preserve">signed in adobe as a pdf :)</w:t>
       </w:r>
     </w:p>
   </w:comment>
-  <w:comment w:author="Joshua Lopez" w:id="12" w:date="2026-04-04T18:21:48Z">
+  <w:comment w:author="Caleb Corlett" w:id="1" w:date="2026-04-04T20:16:43Z">
     <w:p>
       <w:pPr>
         <w:keepNext w:val="0"/>
@@ -6167,11 +6578,11 @@
           <w:vertAlign w:val="baseline"/>
           <w:rtl w:val="0"/>
         </w:rPr>
-        <w:t xml:space="preserve">Swap these around to correspond with the causes correctly</w:t>
+        <w:t xml:space="preserve">Images would be helpful to convey what the admin needs to do / look for.</w:t>
       </w:r>
     </w:p>
   </w:comment>
-  <w:comment w:author="Caleb Corlett" w:id="4" w:date="2026-04-04T20:41:39Z">
+  <w:comment w:author="Caleb Corlett" w:id="2" w:date="2026-04-04T20:22:42Z">
     <w:p>
       <w:pPr>
         <w:keepNext w:val="0"/>
@@ -6222,833 +6633,7 @@
           <w:vertAlign w:val="baseline"/>
           <w:rtl w:val="0"/>
         </w:rPr>
-        <w:t xml:space="preserve">(From Quantitative Rubric) Technically APA requires references to be listed in alphabetical order by author last name, but if I'll be completely honest, idk if whoever grades these documents knows that.</w:t>
-      </w:r>
-    </w:p>
-  </w:comment>
-  <w:comment w:author="Caleb Corlett" w:id="10" w:date="2026-04-04T20:37:13Z">
-    <w:p>
-      <w:pPr>
-        <w:keepNext w:val="0"/>
-        <w:keepLines w:val="0"/>
-        <w:pageBreakBefore w:val="0"/>
-        <w:widowControl w:val="0"/>
-        <w:pBdr>
-          <w:top w:space="0" w:sz="0" w:val="nil"/>
-          <w:left w:space="0" w:sz="0" w:val="nil"/>
-          <w:bottom w:space="0" w:sz="0" w:val="nil"/>
-          <w:right w:space="0" w:sz="0" w:val="nil"/>
-          <w:between w:space="0" w:sz="0" w:val="nil"/>
-        </w:pBdr>
-        <w:shd w:fill="auto" w:val="clear"/>
-        <w:spacing w:after="0" w:before="0" w:line="240" w:lineRule="auto"/>
-        <w:ind w:left="0" w:right="0" w:firstLine="0"/>
-        <w:jc w:val="left"/>
-        <w:rPr>
-          <w:rFonts w:ascii="Arial" w:cs="Arial" w:eastAsia="Arial" w:hAnsi="Arial"/>
-          <w:b w:val="0"/>
-          <w:bCs w:val="0"/>
-          <w:i w:val="0"/>
-          <w:iCs w:val="0"/>
-          <w:smallCaps w:val="0"/>
-          <w:strike w:val="0"/>
-          <w:color w:val="000000"/>
-          <w:sz w:val="22"/>
-          <w:szCs w:val="22"/>
-          <w:u w:val="none"/>
-          <w:shd w:fill="auto" w:val="clear"/>
-          <w:vertAlign w:val="baseline"/>
-        </w:rPr>
-      </w:pPr>
-      <w:r>
-        <w:rPr>
-          <w:rFonts w:ascii="Arial" w:cs="Arial" w:eastAsia="Arial" w:hAnsi="Arial"/>
-          <w:b w:val="0"/>
-          <w:bCs w:val="0"/>
-          <w:i w:val="0"/>
-          <w:iCs w:val="0"/>
-          <w:smallCaps w:val="0"/>
-          <w:strike w:val="0"/>
-          <w:color w:val="000000"/>
-          <w:sz w:val="22"/>
-          <w:szCs w:val="22"/>
-          <w:u w:val="none"/>
-          <w:shd w:fill="auto" w:val="clear"/>
-          <w:vertAlign w:val="baseline"/>
-          <w:rtl w:val="0"/>
-        </w:rPr>
-        <w:t xml:space="preserve">(From Quantitative Rubric) Section needs an introduction.</w:t>
-      </w:r>
-    </w:p>
-  </w:comment>
-  <w:comment w:author="Caleb Corlett" w:id="9" w:date="2026-04-04T20:12:11Z">
-    <w:p>
-      <w:pPr>
-        <w:keepNext w:val="0"/>
-        <w:keepLines w:val="0"/>
-        <w:pageBreakBefore w:val="0"/>
-        <w:widowControl w:val="0"/>
-        <w:pBdr>
-          <w:top w:space="0" w:sz="0" w:val="nil"/>
-          <w:left w:space="0" w:sz="0" w:val="nil"/>
-          <w:bottom w:space="0" w:sz="0" w:val="nil"/>
-          <w:right w:space="0" w:sz="0" w:val="nil"/>
-          <w:between w:space="0" w:sz="0" w:val="nil"/>
-        </w:pBdr>
-        <w:shd w:fill="auto" w:val="clear"/>
-        <w:spacing w:after="0" w:before="0" w:line="240" w:lineRule="auto"/>
-        <w:ind w:left="0" w:right="0" w:firstLine="0"/>
-        <w:jc w:val="left"/>
-        <w:rPr>
-          <w:rFonts w:ascii="Arial" w:cs="Arial" w:eastAsia="Arial" w:hAnsi="Arial"/>
-          <w:b w:val="0"/>
-          <w:bCs w:val="0"/>
-          <w:i w:val="0"/>
-          <w:iCs w:val="0"/>
-          <w:smallCaps w:val="0"/>
-          <w:strike w:val="0"/>
-          <w:color w:val="000000"/>
-          <w:sz w:val="22"/>
-          <w:szCs w:val="22"/>
-          <w:u w:val="none"/>
-          <w:shd w:fill="auto" w:val="clear"/>
-          <w:vertAlign w:val="baseline"/>
-        </w:rPr>
-      </w:pPr>
-      <w:r>
-        <w:rPr>
-          <w:rFonts w:ascii="Arial" w:cs="Arial" w:eastAsia="Arial" w:hAnsi="Arial"/>
-          <w:b w:val="0"/>
-          <w:bCs w:val="0"/>
-          <w:i w:val="0"/>
-          <w:iCs w:val="0"/>
-          <w:smallCaps w:val="0"/>
-          <w:strike w:val="0"/>
-          <w:color w:val="000000"/>
-          <w:sz w:val="22"/>
-          <w:szCs w:val="22"/>
-          <w:u w:val="none"/>
-          <w:shd w:fill="auto" w:val="clear"/>
-          <w:vertAlign w:val="baseline"/>
-          <w:rtl w:val="0"/>
-        </w:rPr>
-        <w:t xml:space="preserve">This is THE time to detail this process. </w:t>
-      </w:r>
-    </w:p>
-    <w:p>
-      <w:pPr>
-        <w:keepNext w:val="0"/>
-        <w:keepLines w:val="0"/>
-        <w:pageBreakBefore w:val="0"/>
-        <w:widowControl w:val="0"/>
-        <w:pBdr>
-          <w:top w:space="0" w:sz="0" w:val="nil"/>
-          <w:left w:space="0" w:sz="0" w:val="nil"/>
-          <w:bottom w:space="0" w:sz="0" w:val="nil"/>
-          <w:right w:space="0" w:sz="0" w:val="nil"/>
-          <w:between w:space="0" w:sz="0" w:val="nil"/>
-        </w:pBdr>
-        <w:shd w:fill="auto" w:val="clear"/>
-        <w:spacing w:after="0" w:before="0" w:line="240" w:lineRule="auto"/>
-        <w:ind w:left="0" w:right="0" w:firstLine="0"/>
-        <w:jc w:val="left"/>
-        <w:rPr>
-          <w:rFonts w:ascii="Arial" w:cs="Arial" w:eastAsia="Arial" w:hAnsi="Arial"/>
-          <w:b w:val="0"/>
-          <w:bCs w:val="0"/>
-          <w:i w:val="0"/>
-          <w:iCs w:val="0"/>
-          <w:smallCaps w:val="0"/>
-          <w:strike w:val="0"/>
-          <w:color w:val="000000"/>
-          <w:sz w:val="22"/>
-          <w:szCs w:val="22"/>
-          <w:u w:val="none"/>
-          <w:shd w:fill="auto" w:val="clear"/>
-          <w:vertAlign w:val="baseline"/>
-        </w:rPr>
-      </w:pPr>
-      <w:r>
-        <w:rPr>
-          <w:rtl w:val="0"/>
-        </w:rPr>
-      </w:r>
-    </w:p>
-    <w:p>
-      <w:pPr>
-        <w:keepNext w:val="0"/>
-        <w:keepLines w:val="0"/>
-        <w:pageBreakBefore w:val="0"/>
-        <w:widowControl w:val="0"/>
-        <w:pBdr>
-          <w:top w:space="0" w:sz="0" w:val="nil"/>
-          <w:left w:space="0" w:sz="0" w:val="nil"/>
-          <w:bottom w:space="0" w:sz="0" w:val="nil"/>
-          <w:right w:space="0" w:sz="0" w:val="nil"/>
-          <w:between w:space="0" w:sz="0" w:val="nil"/>
-        </w:pBdr>
-        <w:shd w:fill="auto" w:val="clear"/>
-        <w:spacing w:after="0" w:before="0" w:line="240" w:lineRule="auto"/>
-        <w:ind w:left="0" w:right="0" w:firstLine="0"/>
-        <w:jc w:val="left"/>
-        <w:rPr>
-          <w:rFonts w:ascii="Arial" w:cs="Arial" w:eastAsia="Arial" w:hAnsi="Arial"/>
-          <w:b w:val="0"/>
-          <w:bCs w:val="0"/>
-          <w:i w:val="0"/>
-          <w:iCs w:val="0"/>
-          <w:smallCaps w:val="0"/>
-          <w:strike w:val="0"/>
-          <w:color w:val="000000"/>
-          <w:sz w:val="22"/>
-          <w:szCs w:val="22"/>
-          <w:u w:val="none"/>
-          <w:shd w:fill="auto" w:val="clear"/>
-          <w:vertAlign w:val="baseline"/>
-        </w:rPr>
-      </w:pPr>
-      <w:r>
-        <w:rPr>
-          <w:rFonts w:ascii="Arial" w:cs="Arial" w:eastAsia="Arial" w:hAnsi="Arial"/>
-          <w:b w:val="0"/>
-          <w:bCs w:val="0"/>
-          <w:i w:val="0"/>
-          <w:iCs w:val="0"/>
-          <w:smallCaps w:val="0"/>
-          <w:strike w:val="0"/>
-          <w:color w:val="000000"/>
-          <w:sz w:val="22"/>
-          <w:szCs w:val="22"/>
-          <w:u w:val="none"/>
-          <w:shd w:fill="auto" w:val="clear"/>
-          <w:vertAlign w:val="baseline"/>
-          <w:rtl w:val="0"/>
-        </w:rPr>
-        <w:t xml:space="preserve">Unless you have this information somewhere else for your client, this will be the first place they check if they forget what they have to do.</w:t>
-      </w:r>
-    </w:p>
-    <w:p>
-      <w:pPr>
-        <w:keepNext w:val="0"/>
-        <w:keepLines w:val="0"/>
-        <w:pageBreakBefore w:val="0"/>
-        <w:widowControl w:val="0"/>
-        <w:pBdr>
-          <w:top w:space="0" w:sz="0" w:val="nil"/>
-          <w:left w:space="0" w:sz="0" w:val="nil"/>
-          <w:bottom w:space="0" w:sz="0" w:val="nil"/>
-          <w:right w:space="0" w:sz="0" w:val="nil"/>
-          <w:between w:space="0" w:sz="0" w:val="nil"/>
-        </w:pBdr>
-        <w:shd w:fill="auto" w:val="clear"/>
-        <w:spacing w:after="0" w:before="0" w:line="240" w:lineRule="auto"/>
-        <w:ind w:left="0" w:right="0" w:firstLine="0"/>
-        <w:jc w:val="left"/>
-        <w:rPr>
-          <w:rFonts w:ascii="Arial" w:cs="Arial" w:eastAsia="Arial" w:hAnsi="Arial"/>
-          <w:b w:val="0"/>
-          <w:bCs w:val="0"/>
-          <w:i w:val="0"/>
-          <w:iCs w:val="0"/>
-          <w:smallCaps w:val="0"/>
-          <w:strike w:val="0"/>
-          <w:color w:val="000000"/>
-          <w:sz w:val="22"/>
-          <w:szCs w:val="22"/>
-          <w:u w:val="none"/>
-          <w:shd w:fill="auto" w:val="clear"/>
-          <w:vertAlign w:val="baseline"/>
-        </w:rPr>
-      </w:pPr>
-      <w:r>
-        <w:rPr>
-          <w:rtl w:val="0"/>
-        </w:rPr>
-      </w:r>
-    </w:p>
-    <w:p>
-      <w:pPr>
-        <w:keepNext w:val="0"/>
-        <w:keepLines w:val="0"/>
-        <w:pageBreakBefore w:val="0"/>
-        <w:widowControl w:val="0"/>
-        <w:pBdr>
-          <w:top w:space="0" w:sz="0" w:val="nil"/>
-          <w:left w:space="0" w:sz="0" w:val="nil"/>
-          <w:bottom w:space="0" w:sz="0" w:val="nil"/>
-          <w:right w:space="0" w:sz="0" w:val="nil"/>
-          <w:between w:space="0" w:sz="0" w:val="nil"/>
-        </w:pBdr>
-        <w:shd w:fill="auto" w:val="clear"/>
-        <w:spacing w:after="0" w:before="0" w:line="240" w:lineRule="auto"/>
-        <w:ind w:left="0" w:right="0" w:firstLine="0"/>
-        <w:jc w:val="left"/>
-        <w:rPr>
-          <w:rFonts w:ascii="Arial" w:cs="Arial" w:eastAsia="Arial" w:hAnsi="Arial"/>
-          <w:b w:val="0"/>
-          <w:bCs w:val="0"/>
-          <w:i w:val="0"/>
-          <w:iCs w:val="0"/>
-          <w:smallCaps w:val="0"/>
-          <w:strike w:val="0"/>
-          <w:color w:val="000000"/>
-          <w:sz w:val="22"/>
-          <w:szCs w:val="22"/>
-          <w:u w:val="none"/>
-          <w:shd w:fill="auto" w:val="clear"/>
-          <w:vertAlign w:val="baseline"/>
-        </w:rPr>
-      </w:pPr>
-      <w:r>
-        <w:rPr>
-          <w:rFonts w:ascii="Arial" w:cs="Arial" w:eastAsia="Arial" w:hAnsi="Arial"/>
-          <w:b w:val="0"/>
-          <w:bCs w:val="0"/>
-          <w:i w:val="0"/>
-          <w:iCs w:val="0"/>
-          <w:smallCaps w:val="0"/>
-          <w:strike w:val="0"/>
-          <w:color w:val="000000"/>
-          <w:sz w:val="22"/>
-          <w:szCs w:val="22"/>
-          <w:u w:val="none"/>
-          <w:shd w:fill="auto" w:val="clear"/>
-          <w:vertAlign w:val="baseline"/>
-          <w:rtl w:val="0"/>
-        </w:rPr>
-        <w:t xml:space="preserve">I don't know Dr. Birkel's technical proficiency, but if they are older in age, they might appreciate some written steps on how to run a .sh script from the terminal.</w:t>
-      </w:r>
-    </w:p>
-  </w:comment>
-  <w:comment w:author="Caleb Corlett" w:id="1" w:date="2026-04-04T20:36:47Z">
-    <w:p>
-      <w:pPr>
-        <w:keepNext w:val="0"/>
-        <w:keepLines w:val="0"/>
-        <w:pageBreakBefore w:val="0"/>
-        <w:widowControl w:val="0"/>
-        <w:pBdr>
-          <w:top w:space="0" w:sz="0" w:val="nil"/>
-          <w:left w:space="0" w:sz="0" w:val="nil"/>
-          <w:bottom w:space="0" w:sz="0" w:val="nil"/>
-          <w:right w:space="0" w:sz="0" w:val="nil"/>
-          <w:between w:space="0" w:sz="0" w:val="nil"/>
-        </w:pBdr>
-        <w:shd w:fill="auto" w:val="clear"/>
-        <w:spacing w:after="0" w:before="0" w:line="240" w:lineRule="auto"/>
-        <w:ind w:left="0" w:right="0" w:firstLine="0"/>
-        <w:jc w:val="left"/>
-        <w:rPr>
-          <w:rFonts w:ascii="Arial" w:cs="Arial" w:eastAsia="Arial" w:hAnsi="Arial"/>
-          <w:b w:val="0"/>
-          <w:bCs w:val="0"/>
-          <w:i w:val="0"/>
-          <w:iCs w:val="0"/>
-          <w:smallCaps w:val="0"/>
-          <w:strike w:val="0"/>
-          <w:color w:val="000000"/>
-          <w:sz w:val="22"/>
-          <w:szCs w:val="22"/>
-          <w:u w:val="none"/>
-          <w:shd w:fill="auto" w:val="clear"/>
-          <w:vertAlign w:val="baseline"/>
-        </w:rPr>
-      </w:pPr>
-      <w:r>
-        <w:rPr>
-          <w:rFonts w:ascii="Arial" w:cs="Arial" w:eastAsia="Arial" w:hAnsi="Arial"/>
-          <w:b w:val="0"/>
-          <w:bCs w:val="0"/>
-          <w:i w:val="0"/>
-          <w:iCs w:val="0"/>
-          <w:smallCaps w:val="0"/>
-          <w:strike w:val="0"/>
-          <w:color w:val="000000"/>
-          <w:sz w:val="22"/>
-          <w:szCs w:val="22"/>
-          <w:u w:val="none"/>
-          <w:shd w:fill="auto" w:val="clear"/>
-          <w:vertAlign w:val="baseline"/>
-          <w:rtl w:val="0"/>
-        </w:rPr>
-        <w:t xml:space="preserve">(From Quantitative Rubric) Section needs an introduction.</w:t>
-      </w:r>
-    </w:p>
-  </w:comment>
-  <w:comment w:author="Joshua Lopez" w:id="5" w:date="2026-04-04T18:15:22Z">
-    <w:p>
-      <w:pPr>
-        <w:keepNext w:val="0"/>
-        <w:keepLines w:val="0"/>
-        <w:pageBreakBefore w:val="0"/>
-        <w:widowControl w:val="0"/>
-        <w:pBdr>
-          <w:top w:space="0" w:sz="0" w:val="nil"/>
-          <w:left w:space="0" w:sz="0" w:val="nil"/>
-          <w:bottom w:space="0" w:sz="0" w:val="nil"/>
-          <w:right w:space="0" w:sz="0" w:val="nil"/>
-          <w:between w:space="0" w:sz="0" w:val="nil"/>
-        </w:pBdr>
-        <w:shd w:fill="auto" w:val="clear"/>
-        <w:spacing w:after="0" w:before="0" w:line="240" w:lineRule="auto"/>
-        <w:ind w:left="0" w:right="0" w:firstLine="0"/>
-        <w:jc w:val="left"/>
-        <w:rPr>
-          <w:rFonts w:ascii="Arial" w:cs="Arial" w:eastAsia="Arial" w:hAnsi="Arial"/>
-          <w:b w:val="0"/>
-          <w:bCs w:val="0"/>
-          <w:i w:val="0"/>
-          <w:iCs w:val="0"/>
-          <w:smallCaps w:val="0"/>
-          <w:strike w:val="0"/>
-          <w:color w:val="000000"/>
-          <w:sz w:val="22"/>
-          <w:szCs w:val="22"/>
-          <w:u w:val="none"/>
-          <w:shd w:fill="auto" w:val="clear"/>
-          <w:vertAlign w:val="baseline"/>
-        </w:rPr>
-      </w:pPr>
-      <w:r>
-        <w:rPr>
-          <w:rFonts w:ascii="Arial" w:cs="Arial" w:eastAsia="Arial" w:hAnsi="Arial"/>
-          <w:b w:val="0"/>
-          <w:bCs w:val="0"/>
-          <w:i w:val="0"/>
-          <w:iCs w:val="0"/>
-          <w:smallCaps w:val="0"/>
-          <w:strike w:val="0"/>
-          <w:color w:val="000000"/>
-          <w:sz w:val="22"/>
-          <w:szCs w:val="22"/>
-          <w:u w:val="none"/>
-          <w:shd w:fill="auto" w:val="clear"/>
-          <w:vertAlign w:val="baseline"/>
-          <w:rtl w:val="0"/>
-        </w:rPr>
-        <w:t xml:space="preserve">Nitpick but a page break here would be good</w:t>
-      </w:r>
-    </w:p>
-  </w:comment>
-  <w:comment w:author="Joshua Lopez" w:id="2" w:date="2026-04-04T18:13:52Z">
-    <w:p>
-      <w:pPr>
-        <w:keepNext w:val="0"/>
-        <w:keepLines w:val="0"/>
-        <w:pageBreakBefore w:val="0"/>
-        <w:widowControl w:val="0"/>
-        <w:pBdr>
-          <w:top w:space="0" w:sz="0" w:val="nil"/>
-          <w:left w:space="0" w:sz="0" w:val="nil"/>
-          <w:bottom w:space="0" w:sz="0" w:val="nil"/>
-          <w:right w:space="0" w:sz="0" w:val="nil"/>
-          <w:between w:space="0" w:sz="0" w:val="nil"/>
-        </w:pBdr>
-        <w:shd w:fill="auto" w:val="clear"/>
-        <w:spacing w:after="0" w:before="0" w:line="240" w:lineRule="auto"/>
-        <w:ind w:left="0" w:right="0" w:firstLine="0"/>
-        <w:jc w:val="left"/>
-        <w:rPr>
-          <w:rFonts w:ascii="Arial" w:cs="Arial" w:eastAsia="Arial" w:hAnsi="Arial"/>
-          <w:b w:val="0"/>
-          <w:bCs w:val="0"/>
-          <w:i w:val="0"/>
-          <w:iCs w:val="0"/>
-          <w:smallCaps w:val="0"/>
-          <w:strike w:val="0"/>
-          <w:color w:val="000000"/>
-          <w:sz w:val="22"/>
-          <w:szCs w:val="22"/>
-          <w:u w:val="none"/>
-          <w:shd w:fill="auto" w:val="clear"/>
-          <w:vertAlign w:val="baseline"/>
-        </w:rPr>
-      </w:pPr>
-      <w:r>
-        <w:rPr>
-          <w:rFonts w:ascii="Arial" w:cs="Arial" w:eastAsia="Arial" w:hAnsi="Arial"/>
-          <w:b w:val="0"/>
-          <w:bCs w:val="0"/>
-          <w:i w:val="0"/>
-          <w:iCs w:val="0"/>
-          <w:smallCaps w:val="0"/>
-          <w:strike w:val="0"/>
-          <w:color w:val="000000"/>
-          <w:sz w:val="22"/>
-          <w:szCs w:val="22"/>
-          <w:u w:val="none"/>
-          <w:shd w:fill="auto" w:val="clear"/>
-          <w:vertAlign w:val="baseline"/>
-          <w:rtl w:val="0"/>
-        </w:rPr>
-        <w:t xml:space="preserve">Leftover guidelines. Should remove</w:t>
-      </w:r>
-    </w:p>
-  </w:comment>
-  <w:comment w:author="Caleb Corlett" w:id="3" w:date="2026-04-04T20:25:44Z">
-    <w:p>
-      <w:pPr>
-        <w:keepNext w:val="0"/>
-        <w:keepLines w:val="0"/>
-        <w:pageBreakBefore w:val="0"/>
-        <w:widowControl w:val="0"/>
-        <w:pBdr>
-          <w:top w:space="0" w:sz="0" w:val="nil"/>
-          <w:left w:space="0" w:sz="0" w:val="nil"/>
-          <w:bottom w:space="0" w:sz="0" w:val="nil"/>
-          <w:right w:space="0" w:sz="0" w:val="nil"/>
-          <w:between w:space="0" w:sz="0" w:val="nil"/>
-        </w:pBdr>
-        <w:shd w:fill="auto" w:val="clear"/>
-        <w:spacing w:after="0" w:before="0" w:line="240" w:lineRule="auto"/>
-        <w:ind w:left="0" w:right="0" w:firstLine="0"/>
-        <w:jc w:val="left"/>
-        <w:rPr>
-          <w:rFonts w:ascii="Arial" w:cs="Arial" w:eastAsia="Arial" w:hAnsi="Arial"/>
-          <w:b w:val="0"/>
-          <w:bCs w:val="0"/>
-          <w:i w:val="0"/>
-          <w:iCs w:val="0"/>
-          <w:smallCaps w:val="0"/>
-          <w:strike w:val="0"/>
-          <w:color w:val="000000"/>
-          <w:sz w:val="22"/>
-          <w:szCs w:val="22"/>
-          <w:u w:val="none"/>
-          <w:shd w:fill="auto" w:val="clear"/>
-          <w:vertAlign w:val="baseline"/>
-        </w:rPr>
-      </w:pPr>
-      <w:r>
-        <w:rPr>
-          <w:rFonts w:ascii="Arial" w:cs="Arial" w:eastAsia="Arial" w:hAnsi="Arial"/>
-          <w:b w:val="0"/>
-          <w:bCs w:val="0"/>
-          <w:i w:val="0"/>
-          <w:iCs w:val="0"/>
-          <w:smallCaps w:val="0"/>
-          <w:strike w:val="0"/>
-          <w:color w:val="000000"/>
-          <w:sz w:val="22"/>
-          <w:szCs w:val="22"/>
-          <w:u w:val="none"/>
-          <w:shd w:fill="auto" w:val="clear"/>
-          <w:vertAlign w:val="baseline"/>
-          <w:rtl w:val="0"/>
-        </w:rPr>
-        <w:t xml:space="preserve">ClimateReanalyzer and Openspace are formatted differently here from the rest of the document.</w:t>
-      </w:r>
-    </w:p>
-    <w:p>
-      <w:pPr>
-        <w:keepNext w:val="0"/>
-        <w:keepLines w:val="0"/>
-        <w:pageBreakBefore w:val="0"/>
-        <w:widowControl w:val="0"/>
-        <w:pBdr>
-          <w:top w:space="0" w:sz="0" w:val="nil"/>
-          <w:left w:space="0" w:sz="0" w:val="nil"/>
-          <w:bottom w:space="0" w:sz="0" w:val="nil"/>
-          <w:right w:space="0" w:sz="0" w:val="nil"/>
-          <w:between w:space="0" w:sz="0" w:val="nil"/>
-        </w:pBdr>
-        <w:shd w:fill="auto" w:val="clear"/>
-        <w:spacing w:after="0" w:before="0" w:line="240" w:lineRule="auto"/>
-        <w:ind w:left="0" w:right="0" w:firstLine="0"/>
-        <w:jc w:val="left"/>
-        <w:rPr>
-          <w:rFonts w:ascii="Arial" w:cs="Arial" w:eastAsia="Arial" w:hAnsi="Arial"/>
-          <w:b w:val="0"/>
-          <w:bCs w:val="0"/>
-          <w:i w:val="0"/>
-          <w:iCs w:val="0"/>
-          <w:smallCaps w:val="0"/>
-          <w:strike w:val="0"/>
-          <w:color w:val="000000"/>
-          <w:sz w:val="22"/>
-          <w:szCs w:val="22"/>
-          <w:u w:val="none"/>
-          <w:shd w:fill="auto" w:val="clear"/>
-          <w:vertAlign w:val="baseline"/>
-        </w:rPr>
-      </w:pPr>
-      <w:r>
-        <w:rPr>
-          <w:rtl w:val="0"/>
-        </w:rPr>
-      </w:r>
-    </w:p>
-    <w:p>
-      <w:pPr>
-        <w:keepNext w:val="0"/>
-        <w:keepLines w:val="0"/>
-        <w:pageBreakBefore w:val="0"/>
-        <w:widowControl w:val="0"/>
-        <w:pBdr>
-          <w:top w:space="0" w:sz="0" w:val="nil"/>
-          <w:left w:space="0" w:sz="0" w:val="nil"/>
-          <w:bottom w:space="0" w:sz="0" w:val="nil"/>
-          <w:right w:space="0" w:sz="0" w:val="nil"/>
-          <w:between w:space="0" w:sz="0" w:val="nil"/>
-        </w:pBdr>
-        <w:shd w:fill="auto" w:val="clear"/>
-        <w:spacing w:after="0" w:before="0" w:line="240" w:lineRule="auto"/>
-        <w:ind w:left="0" w:right="0" w:firstLine="0"/>
-        <w:jc w:val="left"/>
-        <w:rPr>
-          <w:rFonts w:ascii="Arial" w:cs="Arial" w:eastAsia="Arial" w:hAnsi="Arial"/>
-          <w:b w:val="0"/>
-          <w:bCs w:val="0"/>
-          <w:i w:val="0"/>
-          <w:iCs w:val="0"/>
-          <w:smallCaps w:val="0"/>
-          <w:strike w:val="0"/>
-          <w:color w:val="000000"/>
-          <w:sz w:val="22"/>
-          <w:szCs w:val="22"/>
-          <w:u w:val="none"/>
-          <w:shd w:fill="auto" w:val="clear"/>
-          <w:vertAlign w:val="baseline"/>
-        </w:rPr>
-      </w:pPr>
-      <w:r>
-        <w:rPr>
-          <w:rFonts w:ascii="Arial" w:cs="Arial" w:eastAsia="Arial" w:hAnsi="Arial"/>
-          <w:b w:val="0"/>
-          <w:bCs w:val="0"/>
-          <w:i w:val="0"/>
-          <w:iCs w:val="0"/>
-          <w:smallCaps w:val="0"/>
-          <w:strike w:val="0"/>
-          <w:color w:val="000000"/>
-          <w:sz w:val="22"/>
-          <w:szCs w:val="22"/>
-          <w:u w:val="none"/>
-          <w:shd w:fill="auto" w:val="clear"/>
-          <w:vertAlign w:val="baseline"/>
-          <w:rtl w:val="0"/>
-        </w:rPr>
-        <w:t xml:space="preserve">(Climate Reanalyzer and OpenSpace elsewhere)</w:t>
-      </w:r>
-    </w:p>
-  </w:comment>
-  <w:comment w:author="Joshua Lopez" w:id="8" w:date="2026-04-04T18:19:00Z">
-    <w:p>
-      <w:pPr>
-        <w:keepNext w:val="0"/>
-        <w:keepLines w:val="0"/>
-        <w:pageBreakBefore w:val="0"/>
-        <w:widowControl w:val="0"/>
-        <w:pBdr>
-          <w:top w:space="0" w:sz="0" w:val="nil"/>
-          <w:left w:space="0" w:sz="0" w:val="nil"/>
-          <w:bottom w:space="0" w:sz="0" w:val="nil"/>
-          <w:right w:space="0" w:sz="0" w:val="nil"/>
-          <w:between w:space="0" w:sz="0" w:val="nil"/>
-        </w:pBdr>
-        <w:shd w:fill="auto" w:val="clear"/>
-        <w:spacing w:after="0" w:before="0" w:line="240" w:lineRule="auto"/>
-        <w:ind w:left="0" w:right="0" w:firstLine="0"/>
-        <w:jc w:val="left"/>
-        <w:rPr>
-          <w:rFonts w:ascii="Arial" w:cs="Arial" w:eastAsia="Arial" w:hAnsi="Arial"/>
-          <w:b w:val="0"/>
-          <w:bCs w:val="0"/>
-          <w:i w:val="0"/>
-          <w:iCs w:val="0"/>
-          <w:smallCaps w:val="0"/>
-          <w:strike w:val="0"/>
-          <w:color w:val="000000"/>
-          <w:sz w:val="22"/>
-          <w:szCs w:val="22"/>
-          <w:u w:val="none"/>
-          <w:shd w:fill="auto" w:val="clear"/>
-          <w:vertAlign w:val="baseline"/>
-        </w:rPr>
-      </w:pPr>
-      <w:r>
-        <w:rPr>
-          <w:rFonts w:ascii="Arial" w:cs="Arial" w:eastAsia="Arial" w:hAnsi="Arial"/>
-          <w:b w:val="0"/>
-          <w:bCs w:val="0"/>
-          <w:i w:val="0"/>
-          <w:iCs w:val="0"/>
-          <w:smallCaps w:val="0"/>
-          <w:strike w:val="0"/>
-          <w:color w:val="000000"/>
-          <w:sz w:val="22"/>
-          <w:szCs w:val="22"/>
-          <w:u w:val="none"/>
-          <w:shd w:fill="auto" w:val="clear"/>
-          <w:vertAlign w:val="baseline"/>
-          <w:rtl w:val="0"/>
-        </w:rPr>
-        <w:t xml:space="preserve">Another page break</w:t>
-      </w:r>
-    </w:p>
-  </w:comment>
-  <w:comment w:author="Caleb Corlett" w:id="6" w:date="2026-04-04T20:36:20Z">
-    <w:p>
-      <w:pPr>
-        <w:keepNext w:val="0"/>
-        <w:keepLines w:val="0"/>
-        <w:pageBreakBefore w:val="0"/>
-        <w:widowControl w:val="0"/>
-        <w:pBdr>
-          <w:top w:space="0" w:sz="0" w:val="nil"/>
-          <w:left w:space="0" w:sz="0" w:val="nil"/>
-          <w:bottom w:space="0" w:sz="0" w:val="nil"/>
-          <w:right w:space="0" w:sz="0" w:val="nil"/>
-          <w:between w:space="0" w:sz="0" w:val="nil"/>
-        </w:pBdr>
-        <w:shd w:fill="auto" w:val="clear"/>
-        <w:spacing w:after="0" w:before="0" w:line="240" w:lineRule="auto"/>
-        <w:ind w:left="0" w:right="0" w:firstLine="0"/>
-        <w:jc w:val="left"/>
-        <w:rPr>
-          <w:rFonts w:ascii="Arial" w:cs="Arial" w:eastAsia="Arial" w:hAnsi="Arial"/>
-          <w:b w:val="0"/>
-          <w:bCs w:val="0"/>
-          <w:i w:val="0"/>
-          <w:iCs w:val="0"/>
-          <w:smallCaps w:val="0"/>
-          <w:strike w:val="0"/>
-          <w:color w:val="000000"/>
-          <w:sz w:val="22"/>
-          <w:szCs w:val="22"/>
-          <w:u w:val="none"/>
-          <w:shd w:fill="auto" w:val="clear"/>
-          <w:vertAlign w:val="baseline"/>
-        </w:rPr>
-      </w:pPr>
-      <w:r>
-        <w:rPr>
-          <w:rFonts w:ascii="Arial" w:cs="Arial" w:eastAsia="Arial" w:hAnsi="Arial"/>
-          <w:b w:val="0"/>
-          <w:bCs w:val="0"/>
-          <w:i w:val="0"/>
-          <w:iCs w:val="0"/>
-          <w:smallCaps w:val="0"/>
-          <w:strike w:val="0"/>
-          <w:color w:val="000000"/>
-          <w:sz w:val="22"/>
-          <w:szCs w:val="22"/>
-          <w:u w:val="none"/>
-          <w:shd w:fill="auto" w:val="clear"/>
-          <w:vertAlign w:val="baseline"/>
-          <w:rtl w:val="0"/>
-        </w:rPr>
-        <w:t xml:space="preserve">(From Quantitative Rubric) Section needs an introduction</w:t>
-      </w:r>
-    </w:p>
-  </w:comment>
-  <w:comment w:author="Caleb Corlett" w:id="13" w:date="2026-04-04T20:22:42Z">
-    <w:p>
-      <w:pPr>
-        <w:keepNext w:val="0"/>
-        <w:keepLines w:val="0"/>
-        <w:pageBreakBefore w:val="0"/>
-        <w:widowControl w:val="0"/>
-        <w:pBdr>
-          <w:top w:space="0" w:sz="0" w:val="nil"/>
-          <w:left w:space="0" w:sz="0" w:val="nil"/>
-          <w:bottom w:space="0" w:sz="0" w:val="nil"/>
-          <w:right w:space="0" w:sz="0" w:val="nil"/>
-          <w:between w:space="0" w:sz="0" w:val="nil"/>
-        </w:pBdr>
-        <w:shd w:fill="auto" w:val="clear"/>
-        <w:spacing w:after="0" w:before="0" w:line="240" w:lineRule="auto"/>
-        <w:ind w:left="0" w:right="0" w:firstLine="0"/>
-        <w:jc w:val="left"/>
-        <w:rPr>
-          <w:rFonts w:ascii="Arial" w:cs="Arial" w:eastAsia="Arial" w:hAnsi="Arial"/>
-          <w:b w:val="0"/>
-          <w:bCs w:val="0"/>
-          <w:i w:val="0"/>
-          <w:iCs w:val="0"/>
-          <w:smallCaps w:val="0"/>
-          <w:strike w:val="0"/>
-          <w:color w:val="000000"/>
-          <w:sz w:val="22"/>
-          <w:szCs w:val="22"/>
-          <w:u w:val="none"/>
-          <w:shd w:fill="auto" w:val="clear"/>
-          <w:vertAlign w:val="baseline"/>
-        </w:rPr>
-      </w:pPr>
-      <w:r>
-        <w:rPr>
-          <w:rFonts w:ascii="Arial" w:cs="Arial" w:eastAsia="Arial" w:hAnsi="Arial"/>
-          <w:b w:val="0"/>
-          <w:bCs w:val="0"/>
-          <w:i w:val="0"/>
-          <w:iCs w:val="0"/>
-          <w:smallCaps w:val="0"/>
-          <w:strike w:val="0"/>
-          <w:color w:val="000000"/>
-          <w:sz w:val="22"/>
-          <w:szCs w:val="22"/>
-          <w:u w:val="none"/>
-          <w:shd w:fill="auto" w:val="clear"/>
-          <w:vertAlign w:val="baseline"/>
-          <w:rtl w:val="0"/>
-        </w:rPr>
         <w:t xml:space="preserve">This section sounds like there is blame on you when there is not. The content of this can be moved to the "Issue" section</w:t>
-      </w:r>
-    </w:p>
-  </w:comment>
-  <w:comment w:author="Joshua Lopez" w:id="7" w:date="2026-04-04T18:17:00Z">
-    <w:p>
-      <w:pPr>
-        <w:keepNext w:val="0"/>
-        <w:keepLines w:val="0"/>
-        <w:pageBreakBefore w:val="0"/>
-        <w:widowControl w:val="0"/>
-        <w:pBdr>
-          <w:top w:space="0" w:sz="0" w:val="nil"/>
-          <w:left w:space="0" w:sz="0" w:val="nil"/>
-          <w:bottom w:space="0" w:sz="0" w:val="nil"/>
-          <w:right w:space="0" w:sz="0" w:val="nil"/>
-          <w:between w:space="0" w:sz="0" w:val="nil"/>
-        </w:pBdr>
-        <w:shd w:fill="auto" w:val="clear"/>
-        <w:spacing w:after="0" w:before="0" w:line="240" w:lineRule="auto"/>
-        <w:ind w:left="0" w:right="0" w:firstLine="0"/>
-        <w:jc w:val="left"/>
-        <w:rPr>
-          <w:rFonts w:ascii="Arial" w:cs="Arial" w:eastAsia="Arial" w:hAnsi="Arial"/>
-          <w:b w:val="0"/>
-          <w:bCs w:val="0"/>
-          <w:i w:val="0"/>
-          <w:iCs w:val="0"/>
-          <w:smallCaps w:val="0"/>
-          <w:strike w:val="0"/>
-          <w:color w:val="000000"/>
-          <w:sz w:val="22"/>
-          <w:szCs w:val="22"/>
-          <w:u w:val="none"/>
-          <w:shd w:fill="auto" w:val="clear"/>
-          <w:vertAlign w:val="baseline"/>
-        </w:rPr>
-      </w:pPr>
-      <w:r>
-        <w:rPr>
-          <w:rFonts w:ascii="Arial" w:cs="Arial" w:eastAsia="Arial" w:hAnsi="Arial"/>
-          <w:b w:val="0"/>
-          <w:bCs w:val="0"/>
-          <w:i w:val="0"/>
-          <w:iCs w:val="0"/>
-          <w:smallCaps w:val="0"/>
-          <w:strike w:val="0"/>
-          <w:color w:val="000000"/>
-          <w:sz w:val="22"/>
-          <w:szCs w:val="22"/>
-          <w:u w:val="none"/>
-          <w:shd w:fill="auto" w:val="clear"/>
-          <w:vertAlign w:val="baseline"/>
-          <w:rtl w:val="0"/>
-        </w:rPr>
-        <w:t xml:space="preserve">first reference of an abbreviation should be spelled out</w:t>
       </w:r>
     </w:p>
   </w:comment>
@@ -7057,21 +6642,11 @@
 
 <file path=word/commentsExtended.xml><?xml version="1.0" encoding="utf-8"?>
 <w15:commentsEx xmlns:mc="http://schemas.openxmlformats.org/markup-compatibility/2006" xmlns:o="urn:schemas-microsoft-com:office:office" xmlns:r="http://schemas.openxmlformats.org/officeDocument/2006/relationships" xmlns:m="http://schemas.openxmlformats.org/officeDocument/2006/math" xmlns:v="urn:schemas-microsoft-com:vml" xmlns:wp="http://schemas.openxmlformats.org/drawingml/2006/wordprocessingDrawing" xmlns:w10="urn:schemas-microsoft-com:office:word" xmlns:w="http://schemas.openxmlformats.org/wordprocessingml/2006/main" xmlns:wne="http://schemas.microsoft.com/office/word/2006/wordml" xmlns:sl="http://schemas.openxmlformats.org/schemaLibrary/2006/main" xmlns:a="http://schemas.openxmlformats.org/drawingml/2006/main" xmlns:pic="http://schemas.openxmlformats.org/drawingml/2006/picture" xmlns:c="http://schemas.openxmlformats.org/drawingml/2006/chart" xmlns:lc="http://schemas.openxmlformats.org/drawingml/2006/lockedCanvas" xmlns:dgm="http://schemas.openxmlformats.org/drawingml/2006/diagram" xmlns:wps="http://schemas.microsoft.com/office/word/2010/wordprocessingShape" xmlns:wpg="http://schemas.microsoft.com/office/word/2010/wordprocessingGroup" xmlns:w14="http://schemas.microsoft.com/office/word/2010/wordml" xmlns:w15="http://schemas.microsoft.com/office/word/2012/wordml" xmlns:w16="http://schemas.microsoft.com/office/word/2018/wordml" xmlns:w16cex="http://schemas.microsoft.com/office/word/2018/wordml/cex" xmlns:w16cid="http://schemas.microsoft.com/office/word/2016/wordml/cid" xmlns="http://schemas.microsoft.com/office/tasks/2019/documenttasks" xmlns:cr="http://schemas.microsoft.com/office/comments/2020/reactions">
-  <w15:commentEx w15:paraId="00000133" w15:done="0"/>
-  <w15:commentEx w15:paraId="00000134" w15:done="0"/>
-  <w15:commentEx w15:paraId="00000135" w15:done="0"/>
-  <w15:commentEx w15:paraId="00000136" w15:done="0"/>
-  <w15:commentEx w15:paraId="00000137" w15:done="0"/>
-  <w15:commentEx w15:paraId="00000138" w15:done="0"/>
-  <w15:commentEx w15:paraId="0000013D" w15:done="0"/>
-  <w15:commentEx w15:paraId="0000013E" w15:done="0"/>
-  <w15:commentEx w15:paraId="0000013F" w15:done="0"/>
-  <w15:commentEx w15:paraId="00000140" w15:done="0"/>
-  <w15:commentEx w15:paraId="00000143" w15:done="0"/>
-  <w15:commentEx w15:paraId="00000144" w15:done="0"/>
-  <w15:commentEx w15:paraId="00000145" w15:done="0"/>
-  <w15:commentEx w15:paraId="00000146" w15:done="0"/>
-  <w15:commentEx w15:paraId="00000147" w15:done="0"/>
+  <w15:commentEx w15:paraId="0000014F" w15:done="0"/>
+  <w15:commentEx w15:paraId="00000150" w15:done="0"/>
+  <w15:commentEx w15:paraId="00000151" w15:done="0"/>
+  <w15:commentEx w15:paraId="00000152" w15:done="0"/>
+  <w15:commentEx w15:paraId="00000153" w15:done="0"/>
 </w15:commentsEx>
 </file>
 
@@ -8702,7 +8277,7 @@
 
 <file path=customXML/item1.xml><?xml version="1.0" encoding="utf-8"?>
 <go:gDocsCustomXmlDataStorage xmlns:go="http://customooxmlschemas.google.com/" xmlns:r="http://schemas.openxmlformats.org/officeDocument/2006/relationships" uri="GoogleDocsCustomDataVersion2">
-  <go:docsCustomData xmlns:go="http://customooxmlschemas.google.com/" roundtripDataSignature="AMtx7mgHT3owkZrz8+Cl4rn9t8p+HeHHCA==">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</go:docsCustomData>
+  <go:docsCustomData xmlns:go="http://customooxmlschemas.google.com/" roundtripDataSignature="AMtx7mg+2G5tEzmijC6Ao0QdQE6r5/sS+A==">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</go:docsCustomData>
 </go:gDocsCustomXmlDataStorage>
 </file>
 

</xml_diff>